<commit_message>
Consolidate school privacy and lesson truth
</commit_message>
<xml_diff>
--- a/public/docs/schools-au/02-lesson-cards.docx
+++ b/public/docs/schools-au/02-lesson-cards.docx
@@ -49,7 +49,7 @@
           <w:sz w:val="24"/>
           <w:szCs w:val="24"/>
         </w:rPr>
-        <w:t xml:space="preserve">20-minute teacher-led sessions for Years 3–6</w:t>
+        <w:t xml:space="preserve">15–20 minute teacher-led sessions for Years 3–6</w:t>
       </w:r>
     </w:p>
     <w:p>
@@ -66,7 +66,7 @@
           <w:sz w:val="22"/>
           <w:szCs w:val="22"/>
         </w:rPr>
-        <w:t xml:space="preserve">Each lesson card: 20 minutes, one clear outcome, simple teacher language, light evidence only.</w:t>
+        <w:t xml:space="preserve">Each lesson card has one learning intention, one activity, one reflection and a visible stopping point. Light evidence only.</w:t>
       </w:r>
     </w:p>
     <w:p>
@@ -79,7 +79,7 @@
         <w:pStyle w:val="Heading3"/>
       </w:pPr>
       <w:r>
-        <w:t xml:space="preserve">Session 1: Meet the Digital Companion</w:t>
+        <w:t xml:space="preserve">Session 1: Meet the System</w:t>
       </w:r>
     </w:p>
     <w:tbl>
@@ -153,7 +153,7 @@
                 <w:sz w:val="20"/>
                 <w:szCs w:val="20"/>
               </w:rPr>
-              <w:t xml:space="preserve">20 minutes</w:t>
+              <w:t xml:space="preserve">15 minutes</w:t>
             </w:r>
           </w:p>
         </w:tc>
@@ -183,48 +183,105 @@
                 <w:sz w:val="20"/>
                 <w:szCs w:val="20"/>
               </w:rPr>
-              <w:t xml:space="preserve">Clear outcome</w:t>
-            </w:r>
-          </w:p>
-        </w:tc>
-        <w:tc>
-          <w:tcPr>
-            <w:tcW w:type="dxa" w:w="6986"/>
-            <w:tcBorders>
-              <w:top w:val="single" w:color="CBD5E1" w:sz="1"/>
-              <w:left w:val="single" w:color="CBD5E1" w:sz="1"/>
-              <w:bottom w:val="single" w:color="CBD5E1" w:sz="1"/>
-              <w:right w:val="single" w:color="CBD5E1" w:sz="1"/>
-            </w:tcBorders>
-            <w:tcMar>
-              <w:top w:type="dxa" w:w="60"/>
-              <w:left w:type="dxa" w:w="100"/>
-              <w:bottom w:type="dxa" w:w="60"/>
-              <w:right w:type="dxa" w:w="100"/>
-            </w:tcMar>
-          </w:tcPr>
-          <w:p>
-            <w:r>
-              <w:rPr>
-                <w:rFonts w:ascii="Calibri" w:cs="Calibri" w:eastAsia="Calibri" w:hAnsi="Calibri"/>
-                <w:sz w:val="20"/>
-                <w:szCs w:val="20"/>
-              </w:rPr>
-              <w:t xml:space="preserve">Students explain that a digital system changes when a user gives it input.</w:t>
-            </w:r>
-          </w:p>
-        </w:tc>
-      </w:tr>
-      <w:tr>
-        <w:tc>
-          <w:tcPr>
-            <w:tcW w:type="dxa" w:w="2400"/>
-            <w:tcBorders>
-              <w:top w:val="single" w:color="CBD5E1" w:sz="1"/>
-              <w:left w:val="single" w:color="CBD5E1" w:sz="1"/>
-              <w:bottom w:val="single" w:color="CBD5E1" w:sz="1"/>
-              <w:right w:val="single" w:color="CBD5E1" w:sz="1"/>
-            </w:tcBorders>
+              <w:t xml:space="preserve">Learning intention</w:t>
+            </w:r>
+          </w:p>
+        </w:tc>
+        <w:tc>
+          <w:tcPr>
+            <w:tcW w:type="dxa" w:w="6986"/>
+            <w:tcBorders>
+              <w:top w:val="single" w:color="CBD5E1" w:sz="1"/>
+              <w:left w:val="single" w:color="CBD5E1" w:sz="1"/>
+              <w:bottom w:val="single" w:color="CBD5E1" w:sz="1"/>
+              <w:right w:val="single" w:color="CBD5E1" w:sz="1"/>
+            </w:tcBorders>
+            <w:tcMar>
+              <w:top w:type="dxa" w:w="60"/>
+              <w:left w:type="dxa" w:w="100"/>
+              <w:bottom w:type="dxa" w:w="60"/>
+              <w:right w:type="dxa" w:w="100"/>
+            </w:tcMar>
+          </w:tcPr>
+          <w:p>
+            <w:r>
+              <w:rPr>
+                <w:rFonts w:ascii="Calibri" w:cs="Calibri" w:eastAsia="Calibri" w:hAnsi="Calibri"/>
+                <w:sz w:val="20"/>
+                <w:szCs w:val="20"/>
+              </w:rPr>
+              <w:t xml:space="preserve">I can explain that a digital system takes an input and changes what it shows.</w:t>
+            </w:r>
+          </w:p>
+        </w:tc>
+      </w:tr>
+      <w:tr>
+        <w:tc>
+          <w:tcPr>
+            <w:tcW w:type="dxa" w:w="2400"/>
+            <w:tcBorders>
+              <w:top w:val="single" w:color="CBD5E1" w:sz="1"/>
+              <w:left w:val="single" w:color="CBD5E1" w:sz="1"/>
+              <w:bottom w:val="single" w:color="CBD5E1" w:sz="1"/>
+              <w:right w:val="single" w:color="CBD5E1" w:sz="1"/>
+            </w:tcBorders>
+            <w:tcMar>
+              <w:top w:type="dxa" w:w="60"/>
+              <w:left w:type="dxa" w:w="100"/>
+              <w:bottom w:type="dxa" w:w="60"/>
+              <w:right w:type="dxa" w:w="100"/>
+            </w:tcMar>
+          </w:tcPr>
+          <w:p>
+            <w:r>
+              <w:rPr>
+                <w:rFonts w:ascii="Calibri" w:cs="Calibri" w:eastAsia="Calibri" w:hAnsi="Calibri"/>
+                <w:sz w:val="20"/>
+                <w:szCs w:val="20"/>
+              </w:rPr>
+              <w:t xml:space="preserve">Teacher introduction</w:t>
+            </w:r>
+          </w:p>
+        </w:tc>
+        <w:tc>
+          <w:tcPr>
+            <w:tcW w:type="dxa" w:w="6986"/>
+            <w:tcBorders>
+              <w:top w:val="single" w:color="CBD5E1" w:sz="1"/>
+              <w:left w:val="single" w:color="CBD5E1" w:sz="1"/>
+              <w:bottom w:val="single" w:color="CBD5E1" w:sz="1"/>
+              <w:right w:val="single" w:color="CBD5E1" w:sz="1"/>
+            </w:tcBorders>
+            <w:tcMar>
+              <w:top w:type="dxa" w:w="60"/>
+              <w:left w:type="dxa" w:w="100"/>
+              <w:bottom w:type="dxa" w:w="60"/>
+              <w:right w:type="dxa" w:w="100"/>
+            </w:tcMar>
+          </w:tcPr>
+          <w:p>
+            <w:r>
+              <w:rPr>
+                <w:rFonts w:ascii="Calibri" w:cs="Calibri" w:eastAsia="Calibri" w:hAnsi="Calibri"/>
+                <w:sz w:val="20"/>
+                <w:szCs w:val="20"/>
+              </w:rPr>
+              <w:t xml:space="preserve">Open with one idea only: this is a system, not a video. It waits for something from us, then it changes. Everything else in the sequence builds on that one sentence.</w:t>
+            </w:r>
+          </w:p>
+        </w:tc>
+      </w:tr>
+      <w:tr>
+        <w:tc>
+          <w:tcPr>
+            <w:tcW w:type="dxa" w:w="2400"/>
+            <w:tcBorders>
+              <w:top w:val="single" w:color="CBD5E1" w:sz="1"/>
+              <w:left w:val="single" w:color="CBD5E1" w:sz="1"/>
+              <w:bottom w:val="single" w:color="CBD5E1" w:sz="1"/>
+              <w:right w:val="single" w:color="CBD5E1" w:sz="1"/>
+            </w:tcBorders>
+            <w:shd w:fill="F1F5F9" w:val="clear"/>
             <w:tcMar>
               <w:top w:type="dxa" w:w="60"/>
               <w:left w:type="dxa" w:w="100"/>
@@ -266,7 +323,63 @@
                 <w:sz w:val="20"/>
                 <w:szCs w:val="20"/>
               </w:rPr>
-              <w:t xml:space="preserve">Open the companion, check its companion state, try one action, and describe what changed.</w:t>
+              <w:t xml:space="preserve">Watch the companion, give it one input, and say what changed.</w:t>
+            </w:r>
+          </w:p>
+        </w:tc>
+      </w:tr>
+      <w:tr>
+        <w:tc>
+          <w:tcPr>
+            <w:tcW w:type="dxa" w:w="2400"/>
+            <w:tcBorders>
+              <w:top w:val="single" w:color="CBD5E1" w:sz="1"/>
+              <w:left w:val="single" w:color="CBD5E1" w:sz="1"/>
+              <w:bottom w:val="single" w:color="CBD5E1" w:sz="1"/>
+              <w:right w:val="single" w:color="CBD5E1" w:sz="1"/>
+            </w:tcBorders>
+            <w:tcMar>
+              <w:top w:type="dxa" w:w="60"/>
+              <w:left w:type="dxa" w:w="100"/>
+              <w:bottom w:type="dxa" w:w="60"/>
+              <w:right w:type="dxa" w:w="100"/>
+            </w:tcMar>
+          </w:tcPr>
+          <w:p>
+            <w:r>
+              <w:rPr>
+                <w:rFonts w:ascii="Calibri" w:cs="Calibri" w:eastAsia="Calibri" w:hAnsi="Calibri"/>
+                <w:sz w:val="20"/>
+                <w:szCs w:val="20"/>
+              </w:rPr>
+              <w:t xml:space="preserve">Movement moment</w:t>
+            </w:r>
+          </w:p>
+        </w:tc>
+        <w:tc>
+          <w:tcPr>
+            <w:tcW w:type="dxa" w:w="6986"/>
+            <w:tcBorders>
+              <w:top w:val="single" w:color="CBD5E1" w:sz="1"/>
+              <w:left w:val="single" w:color="CBD5E1" w:sz="1"/>
+              <w:bottom w:val="single" w:color="CBD5E1" w:sz="1"/>
+              <w:right w:val="single" w:color="CBD5E1" w:sz="1"/>
+            </w:tcBorders>
+            <w:tcMar>
+              <w:top w:type="dxa" w:w="60"/>
+              <w:left w:type="dxa" w:w="100"/>
+              <w:bottom w:type="dxa" w:w="60"/>
+              <w:right w:type="dxa" w:w="100"/>
+            </w:tcMar>
+          </w:tcPr>
+          <w:p>
+            <w:r>
+              <w:rPr>
+                <w:rFonts w:ascii="Calibri" w:cs="Calibri" w:eastAsia="Calibri" w:hAnsi="Calibri"/>
+                <w:sz w:val="20"/>
+                <w:szCs w:val="20"/>
+              </w:rPr>
+              <w:t xml:space="preserve">Stand up and copy the companion's movement once, then sit back down.</w:t>
             </w:r>
           </w:p>
         </w:tc>
@@ -296,34 +409,34 @@
                 <w:sz w:val="20"/>
                 <w:szCs w:val="20"/>
               </w:rPr>
-              <w:t xml:space="preserve">Teacher prompt</w:t>
-            </w:r>
-          </w:p>
-        </w:tc>
-        <w:tc>
-          <w:tcPr>
-            <w:tcW w:type="dxa" w:w="6986"/>
-            <w:tcBorders>
-              <w:top w:val="single" w:color="CBD5E1" w:sz="1"/>
-              <w:left w:val="single" w:color="CBD5E1" w:sz="1"/>
-              <w:bottom w:val="single" w:color="CBD5E1" w:sz="1"/>
-              <w:right w:val="single" w:color="CBD5E1" w:sz="1"/>
-            </w:tcBorders>
-            <w:tcMar>
-              <w:top w:type="dxa" w:w="60"/>
-              <w:left w:type="dxa" w:w="100"/>
-              <w:bottom w:type="dxa" w:w="60"/>
-              <w:right w:type="dxa" w:w="100"/>
-            </w:tcMar>
-          </w:tcPr>
-          <w:p>
-            <w:r>
-              <w:rPr>
-                <w:rFonts w:ascii="Calibri" w:cs="Calibri" w:eastAsia="Calibri" w:hAnsi="Calibri"/>
-                <w:sz w:val="20"/>
-                <w:szCs w:val="20"/>
-              </w:rPr>
-              <w:t xml:space="preserve">“What changed after your action, and how do you know?”</w:t>
+              <w:t xml:space="preserve">Reflection question</w:t>
+            </w:r>
+          </w:p>
+        </w:tc>
+        <w:tc>
+          <w:tcPr>
+            <w:tcW w:type="dxa" w:w="6986"/>
+            <w:tcBorders>
+              <w:top w:val="single" w:color="CBD5E1" w:sz="1"/>
+              <w:left w:val="single" w:color="CBD5E1" w:sz="1"/>
+              <w:bottom w:val="single" w:color="CBD5E1" w:sz="1"/>
+              <w:right w:val="single" w:color="CBD5E1" w:sz="1"/>
+            </w:tcBorders>
+            <w:tcMar>
+              <w:top w:type="dxa" w:w="60"/>
+              <w:left w:type="dxa" w:w="100"/>
+              <w:bottom w:type="dxa" w:w="60"/>
+              <w:right w:type="dxa" w:w="100"/>
+            </w:tcMar>
+          </w:tcPr>
+          <w:p>
+            <w:r>
+              <w:rPr>
+                <w:rFonts w:ascii="Calibri" w:cs="Calibri" w:eastAsia="Calibri" w:hAnsi="Calibri"/>
+                <w:sz w:val="20"/>
+                <w:szCs w:val="20"/>
+              </w:rPr>
+              <w:t xml:space="preserve">“What changed after your input, and how do you know?”</w:t>
             </w:r>
           </w:p>
         </w:tc>
@@ -379,7 +492,7 @@
                 <w:sz w:val="20"/>
                 <w:szCs w:val="20"/>
               </w:rPr>
-              <w:t xml:space="preserve">One sentence: “I chose __ and the companion state changed to __.”</w:t>
+              <w:t xml:space="preserve">One spoken sentence per pair: "I did ___ and the system showed ___."</w:t>
             </w:r>
           </w:p>
         </w:tc>
@@ -395,6 +508,62 @@
               <w:right w:val="single" w:color="CBD5E1" w:sz="1"/>
             </w:tcBorders>
             <w:shd w:fill="F1F5F9" w:val="clear"/>
+            <w:tcMar>
+              <w:top w:type="dxa" w:w="60"/>
+              <w:left w:type="dxa" w:w="100"/>
+              <w:bottom w:type="dxa" w:w="60"/>
+              <w:right w:type="dxa" w:w="100"/>
+            </w:tcMar>
+          </w:tcPr>
+          <w:p>
+            <w:r>
+              <w:rPr>
+                <w:rFonts w:ascii="Calibri" w:cs="Calibri" w:eastAsia="Calibri" w:hAnsi="Calibri"/>
+                <w:sz w:val="20"/>
+                <w:szCs w:val="20"/>
+              </w:rPr>
+              <w:t xml:space="preserve">Stopping point</w:t>
+            </w:r>
+          </w:p>
+        </w:tc>
+        <w:tc>
+          <w:tcPr>
+            <w:tcW w:type="dxa" w:w="6986"/>
+            <w:tcBorders>
+              <w:top w:val="single" w:color="CBD5E1" w:sz="1"/>
+              <w:left w:val="single" w:color="CBD5E1" w:sz="1"/>
+              <w:bottom w:val="single" w:color="CBD5E1" w:sz="1"/>
+              <w:right w:val="single" w:color="CBD5E1" w:sz="1"/>
+            </w:tcBorders>
+            <w:tcMar>
+              <w:top w:type="dxa" w:w="60"/>
+              <w:left w:type="dxa" w:w="100"/>
+              <w:bottom w:type="dxa" w:w="60"/>
+              <w:right w:type="dxa" w:w="100"/>
+            </w:tcMar>
+          </w:tcPr>
+          <w:p>
+            <w:r>
+              <w:rPr>
+                <w:rFonts w:ascii="Calibri" w:cs="Calibri" w:eastAsia="Calibri" w:hAnsi="Calibri"/>
+                <w:sz w:val="20"/>
+                <w:szCs w:val="20"/>
+              </w:rPr>
+              <w:t xml:space="preserve">Session One ends after the class has named one change. Nothing carries over.</w:t>
+            </w:r>
+          </w:p>
+        </w:tc>
+      </w:tr>
+      <w:tr>
+        <w:tc>
+          <w:tcPr>
+            <w:tcW w:type="dxa" w:w="2400"/>
+            <w:tcBorders>
+              <w:top w:val="single" w:color="CBD5E1" w:sz="1"/>
+              <w:left w:val="single" w:color="CBD5E1" w:sz="1"/>
+              <w:bottom w:val="single" w:color="CBD5E1" w:sz="1"/>
+              <w:right w:val="single" w:color="CBD5E1" w:sz="1"/>
+            </w:tcBorders>
             <w:tcMar>
               <w:top w:type="dxa" w:w="60"/>
               <w:left w:type="dxa" w:w="100"/>
@@ -452,7 +621,7 @@
         <w:pStyle w:val="Heading3"/>
       </w:pPr>
       <w:r>
-        <w:t xml:space="preserve">Session 2: Read the Companion State</w:t>
+        <w:t xml:space="preserve">Session 2: Read the Signals</w:t>
       </w:r>
     </w:p>
     <w:tbl>
@@ -526,7 +695,7 @@
                 <w:sz w:val="20"/>
                 <w:szCs w:val="20"/>
               </w:rPr>
-              <w:t xml:space="preserve">20 minutes</w:t>
+              <w:t xml:space="preserve">15 minutes</w:t>
             </w:r>
           </w:p>
         </w:tc>
@@ -556,48 +725,105 @@
                 <w:sz w:val="20"/>
                 <w:szCs w:val="20"/>
               </w:rPr>
-              <w:t xml:space="preserve">Clear outcome</w:t>
-            </w:r>
-          </w:p>
-        </w:tc>
-        <w:tc>
-          <w:tcPr>
-            <w:tcW w:type="dxa" w:w="6986"/>
-            <w:tcBorders>
-              <w:top w:val="single" w:color="CBD5E1" w:sz="1"/>
-              <w:left w:val="single" w:color="CBD5E1" w:sz="1"/>
-              <w:bottom w:val="single" w:color="CBD5E1" w:sz="1"/>
-              <w:right w:val="single" w:color="CBD5E1" w:sz="1"/>
-            </w:tcBorders>
-            <w:tcMar>
-              <w:top w:type="dxa" w:w="60"/>
-              <w:left w:type="dxa" w:w="100"/>
-              <w:bottom w:type="dxa" w:w="60"/>
-              <w:right w:type="dxa" w:w="100"/>
-            </w:tcMar>
-          </w:tcPr>
-          <w:p>
-            <w:r>
-              <w:rPr>
-                <w:rFonts w:ascii="Calibri" w:cs="Calibri" w:eastAsia="Calibri" w:hAnsi="Calibri"/>
-                <w:sz w:val="20"/>
-                <w:szCs w:val="20"/>
-              </w:rPr>
-              <w:t xml:space="preserve">Students read visible state information and make a reasoned action choice.</w:t>
-            </w:r>
-          </w:p>
-        </w:tc>
-      </w:tr>
-      <w:tr>
-        <w:tc>
-          <w:tcPr>
-            <w:tcW w:type="dxa" w:w="2400"/>
-            <w:tcBorders>
-              <w:top w:val="single" w:color="CBD5E1" w:sz="1"/>
-              <w:left w:val="single" w:color="CBD5E1" w:sz="1"/>
-              <w:bottom w:val="single" w:color="CBD5E1" w:sz="1"/>
-              <w:right w:val="single" w:color="CBD5E1" w:sz="1"/>
-            </w:tcBorders>
+              <w:t xml:space="preserve">Learning intention</w:t>
+            </w:r>
+          </w:p>
+        </w:tc>
+        <w:tc>
+          <w:tcPr>
+            <w:tcW w:type="dxa" w:w="6986"/>
+            <w:tcBorders>
+              <w:top w:val="single" w:color="CBD5E1" w:sz="1"/>
+              <w:left w:val="single" w:color="CBD5E1" w:sz="1"/>
+              <w:bottom w:val="single" w:color="CBD5E1" w:sz="1"/>
+              <w:right w:val="single" w:color="CBD5E1" w:sz="1"/>
+            </w:tcBorders>
+            <w:tcMar>
+              <w:top w:type="dxa" w:w="60"/>
+              <w:left w:type="dxa" w:w="100"/>
+              <w:bottom w:type="dxa" w:w="60"/>
+              <w:right w:type="dxa" w:w="100"/>
+            </w:tcMar>
+          </w:tcPr>
+          <w:p>
+            <w:r>
+              <w:rPr>
+                <w:rFonts w:ascii="Calibri" w:cs="Calibri" w:eastAsia="Calibri" w:hAnsi="Calibri"/>
+                <w:sz w:val="20"/>
+                <w:szCs w:val="20"/>
+              </w:rPr>
+              <w:t xml:space="preserve">I can read the signals a system shows and say what they might mean.</w:t>
+            </w:r>
+          </w:p>
+        </w:tc>
+      </w:tr>
+      <w:tr>
+        <w:tc>
+          <w:tcPr>
+            <w:tcW w:type="dxa" w:w="2400"/>
+            <w:tcBorders>
+              <w:top w:val="single" w:color="CBD5E1" w:sz="1"/>
+              <w:left w:val="single" w:color="CBD5E1" w:sz="1"/>
+              <w:bottom w:val="single" w:color="CBD5E1" w:sz="1"/>
+              <w:right w:val="single" w:color="CBD5E1" w:sz="1"/>
+            </w:tcBorders>
+            <w:tcMar>
+              <w:top w:type="dxa" w:w="60"/>
+              <w:left w:type="dxa" w:w="100"/>
+              <w:bottom w:type="dxa" w:w="60"/>
+              <w:right w:type="dxa" w:w="100"/>
+            </w:tcMar>
+          </w:tcPr>
+          <w:p>
+            <w:r>
+              <w:rPr>
+                <w:rFonts w:ascii="Calibri" w:cs="Calibri" w:eastAsia="Calibri" w:hAnsi="Calibri"/>
+                <w:sz w:val="20"/>
+                <w:szCs w:val="20"/>
+              </w:rPr>
+              <w:t xml:space="preserve">Teacher introduction</w:t>
+            </w:r>
+          </w:p>
+        </w:tc>
+        <w:tc>
+          <w:tcPr>
+            <w:tcW w:type="dxa" w:w="6986"/>
+            <w:tcBorders>
+              <w:top w:val="single" w:color="CBD5E1" w:sz="1"/>
+              <w:left w:val="single" w:color="CBD5E1" w:sz="1"/>
+              <w:bottom w:val="single" w:color="CBD5E1" w:sz="1"/>
+              <w:right w:val="single" w:color="CBD5E1" w:sz="1"/>
+            </w:tcBorders>
+            <w:tcMar>
+              <w:top w:type="dxa" w:w="60"/>
+              <w:left w:type="dxa" w:w="100"/>
+              <w:bottom w:type="dxa" w:w="60"/>
+              <w:right w:type="dxa" w:w="100"/>
+            </w:tcMar>
+          </w:tcPr>
+          <w:p>
+            <w:r>
+              <w:rPr>
+                <w:rFonts w:ascii="Calibri" w:cs="Calibri" w:eastAsia="Calibri" w:hAnsi="Calibri"/>
+                <w:sz w:val="20"/>
+                <w:szCs w:val="20"/>
+              </w:rPr>
+              <w:t xml:space="preserve">Signals are guesses, not facts. Ask students to say what a signal might mean and what else it could mean. This is also where classroom feelings-and-settling language belongs: naming a signal, then choosing a calm response.</w:t>
+            </w:r>
+          </w:p>
+        </w:tc>
+      </w:tr>
+      <w:tr>
+        <w:tc>
+          <w:tcPr>
+            <w:tcW w:type="dxa" w:w="2400"/>
+            <w:tcBorders>
+              <w:top w:val="single" w:color="CBD5E1" w:sz="1"/>
+              <w:left w:val="single" w:color="CBD5E1" w:sz="1"/>
+              <w:bottom w:val="single" w:color="CBD5E1" w:sz="1"/>
+              <w:right w:val="single" w:color="CBD5E1" w:sz="1"/>
+            </w:tcBorders>
+            <w:shd w:fill="F1F5F9" w:val="clear"/>
             <w:tcMar>
               <w:top w:type="dxa" w:w="60"/>
               <w:left w:type="dxa" w:w="100"/>
@@ -639,7 +865,63 @@
                 <w:sz w:val="20"/>
                 <w:szCs w:val="20"/>
               </w:rPr>
-              <w:t xml:space="preserve">Check each state indicator, identify the lowest or most urgent state, and choose one response.</w:t>
+              <w:t xml:space="preserve">Look at the companion's signals, name one, and choose a settling action.</w:t>
+            </w:r>
+          </w:p>
+        </w:tc>
+      </w:tr>
+      <w:tr>
+        <w:tc>
+          <w:tcPr>
+            <w:tcW w:type="dxa" w:w="2400"/>
+            <w:tcBorders>
+              <w:top w:val="single" w:color="CBD5E1" w:sz="1"/>
+              <w:left w:val="single" w:color="CBD5E1" w:sz="1"/>
+              <w:bottom w:val="single" w:color="CBD5E1" w:sz="1"/>
+              <w:right w:val="single" w:color="CBD5E1" w:sz="1"/>
+            </w:tcBorders>
+            <w:tcMar>
+              <w:top w:type="dxa" w:w="60"/>
+              <w:left w:type="dxa" w:w="100"/>
+              <w:bottom w:type="dxa" w:w="60"/>
+              <w:right w:type="dxa" w:w="100"/>
+            </w:tcMar>
+          </w:tcPr>
+          <w:p>
+            <w:r>
+              <w:rPr>
+                <w:rFonts w:ascii="Calibri" w:cs="Calibri" w:eastAsia="Calibri" w:hAnsi="Calibri"/>
+                <w:sz w:val="20"/>
+                <w:szCs w:val="20"/>
+              </w:rPr>
+              <w:t xml:space="preserve">Movement moment</w:t>
+            </w:r>
+          </w:p>
+        </w:tc>
+        <w:tc>
+          <w:tcPr>
+            <w:tcW w:type="dxa" w:w="6986"/>
+            <w:tcBorders>
+              <w:top w:val="single" w:color="CBD5E1" w:sz="1"/>
+              <w:left w:val="single" w:color="CBD5E1" w:sz="1"/>
+              <w:bottom w:val="single" w:color="CBD5E1" w:sz="1"/>
+              <w:right w:val="single" w:color="CBD5E1" w:sz="1"/>
+            </w:tcBorders>
+            <w:tcMar>
+              <w:top w:type="dxa" w:w="60"/>
+              <w:left w:type="dxa" w:w="100"/>
+              <w:bottom w:type="dxa" w:w="60"/>
+              <w:right w:type="dxa" w:w="100"/>
+            </w:tcMar>
+          </w:tcPr>
+          <w:p>
+            <w:r>
+              <w:rPr>
+                <w:rFonts w:ascii="Calibri" w:cs="Calibri" w:eastAsia="Calibri" w:hAnsi="Calibri"/>
+                <w:sz w:val="20"/>
+                <w:szCs w:val="20"/>
+              </w:rPr>
+              <w:t xml:space="preserve">Three slow breaths together before choosing the settling action.</w:t>
             </w:r>
           </w:p>
         </w:tc>
@@ -669,34 +951,34 @@
                 <w:sz w:val="20"/>
                 <w:szCs w:val="20"/>
               </w:rPr>
-              <w:t xml:space="preserve">Teacher prompt</w:t>
-            </w:r>
-          </w:p>
-        </w:tc>
-        <w:tc>
-          <w:tcPr>
-            <w:tcW w:type="dxa" w:w="6986"/>
-            <w:tcBorders>
-              <w:top w:val="single" w:color="CBD5E1" w:sz="1"/>
-              <w:left w:val="single" w:color="CBD5E1" w:sz="1"/>
-              <w:bottom w:val="single" w:color="CBD5E1" w:sz="1"/>
-              <w:right w:val="single" w:color="CBD5E1" w:sz="1"/>
-            </w:tcBorders>
-            <w:tcMar>
-              <w:top w:type="dxa" w:w="60"/>
-              <w:left w:type="dxa" w:w="100"/>
-              <w:bottom w:type="dxa" w:w="60"/>
-              <w:right w:type="dxa" w:w="100"/>
-            </w:tcMar>
-          </w:tcPr>
-          <w:p>
-            <w:r>
-              <w:rPr>
-                <w:rFonts w:ascii="Calibri" w:cs="Calibri" w:eastAsia="Calibri" w:hAnsi="Calibri"/>
-                <w:sz w:val="20"/>
-                <w:szCs w:val="20"/>
-              </w:rPr>
-              <w:t xml:space="preserve">“What does the companion state tell you to do next?”</w:t>
+              <w:t xml:space="preserve">Reflection question</w:t>
+            </w:r>
+          </w:p>
+        </w:tc>
+        <w:tc>
+          <w:tcPr>
+            <w:tcW w:type="dxa" w:w="6986"/>
+            <w:tcBorders>
+              <w:top w:val="single" w:color="CBD5E1" w:sz="1"/>
+              <w:left w:val="single" w:color="CBD5E1" w:sz="1"/>
+              <w:bottom w:val="single" w:color="CBD5E1" w:sz="1"/>
+              <w:right w:val="single" w:color="CBD5E1" w:sz="1"/>
+            </w:tcBorders>
+            <w:tcMar>
+              <w:top w:type="dxa" w:w="60"/>
+              <w:left w:type="dxa" w:w="100"/>
+              <w:bottom w:type="dxa" w:w="60"/>
+              <w:right w:type="dxa" w:w="100"/>
+            </w:tcMar>
+          </w:tcPr>
+          <w:p>
+            <w:r>
+              <w:rPr>
+                <w:rFonts w:ascii="Calibri" w:cs="Calibri" w:eastAsia="Calibri" w:hAnsi="Calibri"/>
+                <w:sz w:val="20"/>
+                <w:szCs w:val="20"/>
+              </w:rPr>
+              <w:t xml:space="preserve">“What is one other thing that signal could have meant?”</w:t>
             </w:r>
           </w:p>
         </w:tc>
@@ -752,7 +1034,7 @@
                 <w:sz w:val="20"/>
                 <w:szCs w:val="20"/>
               </w:rPr>
-              <w:t xml:space="preserve">Quick partner explanation using cause-and-effect language.</w:t>
+              <w:t xml:space="preserve">One reflection line linking a signal to a helpful response.</w:t>
             </w:r>
           </w:p>
         </w:tc>
@@ -782,6 +1064,62 @@
                 <w:sz w:val="20"/>
                 <w:szCs w:val="20"/>
               </w:rPr>
+              <w:t xml:space="preserve">Stopping point</w:t>
+            </w:r>
+          </w:p>
+        </w:tc>
+        <w:tc>
+          <w:tcPr>
+            <w:tcW w:type="dxa" w:w="6986"/>
+            <w:tcBorders>
+              <w:top w:val="single" w:color="CBD5E1" w:sz="1"/>
+              <w:left w:val="single" w:color="CBD5E1" w:sz="1"/>
+              <w:bottom w:val="single" w:color="CBD5E1" w:sz="1"/>
+              <w:right w:val="single" w:color="CBD5E1" w:sz="1"/>
+            </w:tcBorders>
+            <w:tcMar>
+              <w:top w:type="dxa" w:w="60"/>
+              <w:left w:type="dxa" w:w="100"/>
+              <w:bottom w:type="dxa" w:w="60"/>
+              <w:right w:type="dxa" w:w="100"/>
+            </w:tcMar>
+          </w:tcPr>
+          <w:p>
+            <w:r>
+              <w:rPr>
+                <w:rFonts w:ascii="Calibri" w:cs="Calibri" w:eastAsia="Calibri" w:hAnsi="Calibri"/>
+                <w:sz w:val="20"/>
+                <w:szCs w:val="20"/>
+              </w:rPr>
+              <w:t xml:space="preserve">Session Two ends after each pair has named one signal and one response.</w:t>
+            </w:r>
+          </w:p>
+        </w:tc>
+      </w:tr>
+      <w:tr>
+        <w:tc>
+          <w:tcPr>
+            <w:tcW w:type="dxa" w:w="2400"/>
+            <w:tcBorders>
+              <w:top w:val="single" w:color="CBD5E1" w:sz="1"/>
+              <w:left w:val="single" w:color="CBD5E1" w:sz="1"/>
+              <w:bottom w:val="single" w:color="CBD5E1" w:sz="1"/>
+              <w:right w:val="single" w:color="CBD5E1" w:sz="1"/>
+            </w:tcBorders>
+            <w:tcMar>
+              <w:top w:type="dxa" w:w="60"/>
+              <w:left w:type="dxa" w:w="100"/>
+              <w:bottom w:type="dxa" w:w="60"/>
+              <w:right w:type="dxa" w:w="100"/>
+            </w:tcMar>
+          </w:tcPr>
+          <w:p>
+            <w:r>
+              <w:rPr>
+                <w:rFonts w:ascii="Calibri" w:cs="Calibri" w:eastAsia="Calibri" w:hAnsi="Calibri"/>
+                <w:sz w:val="20"/>
+                <w:szCs w:val="20"/>
+              </w:rPr>
               <w:t xml:space="preserve">Best-fit use case</w:t>
             </w:r>
           </w:p>
@@ -809,7 +1147,7 @@
                 <w:sz w:val="20"/>
                 <w:szCs w:val="20"/>
               </w:rPr>
-              <w:t xml:space="preserve">Digital Technologies mini-lesson</w:t>
+              <w:t xml:space="preserve">Wellbeing session</w:t>
             </w:r>
           </w:p>
         </w:tc>
@@ -825,7 +1163,7 @@
         <w:pStyle w:val="Heading3"/>
       </w:pPr>
       <w:r>
-        <w:t xml:space="preserve">Session 3: Feelings, Signals and Regulation</w:t>
+        <w:t xml:space="preserve">Session 3: One Identity, Many Representations</w:t>
       </w:r>
     </w:p>
     <w:tbl>
@@ -929,48 +1267,105 @@
                 <w:sz w:val="20"/>
                 <w:szCs w:val="20"/>
               </w:rPr>
-              <w:t xml:space="preserve">Clear outcome</w:t>
-            </w:r>
-          </w:p>
-        </w:tc>
-        <w:tc>
-          <w:tcPr>
-            <w:tcW w:type="dxa" w:w="6986"/>
-            <w:tcBorders>
-              <w:top w:val="single" w:color="CBD5E1" w:sz="1"/>
-              <w:left w:val="single" w:color="CBD5E1" w:sz="1"/>
-              <w:bottom w:val="single" w:color="CBD5E1" w:sz="1"/>
-              <w:right w:val="single" w:color="CBD5E1" w:sz="1"/>
-            </w:tcBorders>
-            <w:tcMar>
-              <w:top w:type="dxa" w:w="60"/>
-              <w:left w:type="dxa" w:w="100"/>
-              <w:bottom w:type="dxa" w:w="60"/>
-              <w:right w:type="dxa" w:w="100"/>
-            </w:tcMar>
-          </w:tcPr>
-          <w:p>
-            <w:r>
-              <w:rPr>
-                <w:rFonts w:ascii="Calibri" w:cs="Calibri" w:eastAsia="Calibri" w:hAnsi="Calibri"/>
-                <w:sz w:val="20"/>
-                <w:szCs w:val="20"/>
-              </w:rPr>
-              <w:t xml:space="preserve">Students connect visible feelings or moods to a simple regulation strategy.</w:t>
-            </w:r>
-          </w:p>
-        </w:tc>
-      </w:tr>
-      <w:tr>
-        <w:tc>
-          <w:tcPr>
-            <w:tcW w:type="dxa" w:w="2400"/>
-            <w:tcBorders>
-              <w:top w:val="single" w:color="CBD5E1" w:sz="1"/>
-              <w:left w:val="single" w:color="CBD5E1" w:sz="1"/>
-              <w:bottom w:val="single" w:color="CBD5E1" w:sz="1"/>
-              <w:right w:val="single" w:color="CBD5E1" w:sz="1"/>
-            </w:tcBorders>
+              <w:t xml:space="preserve">Learning intention</w:t>
+            </w:r>
+          </w:p>
+        </w:tc>
+        <w:tc>
+          <w:tcPr>
+            <w:tcW w:type="dxa" w:w="6986"/>
+            <w:tcBorders>
+              <w:top w:val="single" w:color="CBD5E1" w:sz="1"/>
+              <w:left w:val="single" w:color="CBD5E1" w:sz="1"/>
+              <w:bottom w:val="single" w:color="CBD5E1" w:sz="1"/>
+              <w:right w:val="single" w:color="CBD5E1" w:sz="1"/>
+            </w:tcBorders>
+            <w:tcMar>
+              <w:top w:type="dxa" w:w="60"/>
+              <w:left w:type="dxa" w:w="100"/>
+              <w:bottom w:type="dxa" w:w="60"/>
+              <w:right w:type="dxa" w:w="100"/>
+            </w:tcMar>
+          </w:tcPr>
+          <w:p>
+            <w:r>
+              <w:rPr>
+                <w:rFonts w:ascii="Calibri" w:cs="Calibri" w:eastAsia="Calibri" w:hAnsi="Calibri"/>
+                <w:sz w:val="20"/>
+                <w:szCs w:val="20"/>
+              </w:rPr>
+              <w:t xml:space="preserve">I can explain that one thing can be shown in more than one way and still be the same thing.</w:t>
+            </w:r>
+          </w:p>
+        </w:tc>
+      </w:tr>
+      <w:tr>
+        <w:tc>
+          <w:tcPr>
+            <w:tcW w:type="dxa" w:w="2400"/>
+            <w:tcBorders>
+              <w:top w:val="single" w:color="CBD5E1" w:sz="1"/>
+              <w:left w:val="single" w:color="CBD5E1" w:sz="1"/>
+              <w:bottom w:val="single" w:color="CBD5E1" w:sz="1"/>
+              <w:right w:val="single" w:color="CBD5E1" w:sz="1"/>
+            </w:tcBorders>
+            <w:tcMar>
+              <w:top w:type="dxa" w:w="60"/>
+              <w:left w:type="dxa" w:w="100"/>
+              <w:bottom w:type="dxa" w:w="60"/>
+              <w:right w:type="dxa" w:w="100"/>
+            </w:tcMar>
+          </w:tcPr>
+          <w:p>
+            <w:r>
+              <w:rPr>
+                <w:rFonts w:ascii="Calibri" w:cs="Calibri" w:eastAsia="Calibri" w:hAnsi="Calibri"/>
+                <w:sz w:val="20"/>
+                <w:szCs w:val="20"/>
+              </w:rPr>
+              <w:t xml:space="preserve">Teacher introduction</w:t>
+            </w:r>
+          </w:p>
+        </w:tc>
+        <w:tc>
+          <w:tcPr>
+            <w:tcW w:type="dxa" w:w="6986"/>
+            <w:tcBorders>
+              <w:top w:val="single" w:color="CBD5E1" w:sz="1"/>
+              <w:left w:val="single" w:color="CBD5E1" w:sz="1"/>
+              <w:bottom w:val="single" w:color="CBD5E1" w:sz="1"/>
+              <w:right w:val="single" w:color="CBD5E1" w:sz="1"/>
+            </w:tcBorders>
+            <w:tcMar>
+              <w:top w:type="dxa" w:w="60"/>
+              <w:left w:type="dxa" w:w="100"/>
+              <w:bottom w:type="dxa" w:w="60"/>
+              <w:right w:type="dxa" w:w="100"/>
+            </w:tcMar>
+          </w:tcPr>
+          <w:p>
+            <w:r>
+              <w:rPr>
+                <w:rFonts w:ascii="Calibri" w:cs="Calibri" w:eastAsia="Calibri" w:hAnsi="Calibri"/>
+                <w:sz w:val="20"/>
+                <w:szCs w:val="20"/>
+              </w:rPr>
+              <w:t xml:space="preserve">Show the same companion as a picture, as a word and as a number. Students often assume a different display means a different thing. Naming that mistake out loud is the lesson.</w:t>
+            </w:r>
+          </w:p>
+        </w:tc>
+      </w:tr>
+      <w:tr>
+        <w:tc>
+          <w:tcPr>
+            <w:tcW w:type="dxa" w:w="2400"/>
+            <w:tcBorders>
+              <w:top w:val="single" w:color="CBD5E1" w:sz="1"/>
+              <w:left w:val="single" w:color="CBD5E1" w:sz="1"/>
+              <w:bottom w:val="single" w:color="CBD5E1" w:sz="1"/>
+              <w:right w:val="single" w:color="CBD5E1" w:sz="1"/>
+            </w:tcBorders>
+            <w:shd w:fill="F1F5F9" w:val="clear"/>
             <w:tcMar>
               <w:top w:type="dxa" w:w="60"/>
               <w:left w:type="dxa" w:w="100"/>
@@ -1012,7 +1407,63 @@
                 <w:sz w:val="20"/>
                 <w:szCs w:val="20"/>
               </w:rPr>
-              <w:t xml:space="preserve">Identify a mood, discuss what that mood might signal, and match it with a calming or recovery action.</w:t>
+              <w:t xml:space="preserve">Compare two views of the same companion and find what stayed the same.</w:t>
+            </w:r>
+          </w:p>
+        </w:tc>
+      </w:tr>
+      <w:tr>
+        <w:tc>
+          <w:tcPr>
+            <w:tcW w:type="dxa" w:w="2400"/>
+            <w:tcBorders>
+              <w:top w:val="single" w:color="CBD5E1" w:sz="1"/>
+              <w:left w:val="single" w:color="CBD5E1" w:sz="1"/>
+              <w:bottom w:val="single" w:color="CBD5E1" w:sz="1"/>
+              <w:right w:val="single" w:color="CBD5E1" w:sz="1"/>
+            </w:tcBorders>
+            <w:tcMar>
+              <w:top w:type="dxa" w:w="60"/>
+              <w:left w:type="dxa" w:w="100"/>
+              <w:bottom w:type="dxa" w:w="60"/>
+              <w:right w:type="dxa" w:w="100"/>
+            </w:tcMar>
+          </w:tcPr>
+          <w:p>
+            <w:r>
+              <w:rPr>
+                <w:rFonts w:ascii="Calibri" w:cs="Calibri" w:eastAsia="Calibri" w:hAnsi="Calibri"/>
+                <w:sz w:val="20"/>
+                <w:szCs w:val="20"/>
+              </w:rPr>
+              <w:t xml:space="preserve">Movement moment</w:t>
+            </w:r>
+          </w:p>
+        </w:tc>
+        <w:tc>
+          <w:tcPr>
+            <w:tcW w:type="dxa" w:w="6986"/>
+            <w:tcBorders>
+              <w:top w:val="single" w:color="CBD5E1" w:sz="1"/>
+              <w:left w:val="single" w:color="CBD5E1" w:sz="1"/>
+              <w:bottom w:val="single" w:color="CBD5E1" w:sz="1"/>
+              <w:right w:val="single" w:color="CBD5E1" w:sz="1"/>
+            </w:tcBorders>
+            <w:tcMar>
+              <w:top w:type="dxa" w:w="60"/>
+              <w:left w:type="dxa" w:w="100"/>
+              <w:bottom w:type="dxa" w:w="60"/>
+              <w:right w:type="dxa" w:w="100"/>
+            </w:tcMar>
+          </w:tcPr>
+          <w:p>
+            <w:r>
+              <w:rPr>
+                <w:rFonts w:ascii="Calibri" w:cs="Calibri" w:eastAsia="Calibri" w:hAnsi="Calibri"/>
+                <w:sz w:val="20"/>
+                <w:szCs w:val="20"/>
+              </w:rPr>
+              <w:t xml:space="preserve">Point to the screen with one hand and to your own drawing with the other when they show the same thing.</w:t>
             </w:r>
           </w:p>
         </w:tc>
@@ -1042,34 +1493,34 @@
                 <w:sz w:val="20"/>
                 <w:szCs w:val="20"/>
               </w:rPr>
-              <w:t xml:space="preserve">Teacher prompt</w:t>
-            </w:r>
-          </w:p>
-        </w:tc>
-        <w:tc>
-          <w:tcPr>
-            <w:tcW w:type="dxa" w:w="6986"/>
-            <w:tcBorders>
-              <w:top w:val="single" w:color="CBD5E1" w:sz="1"/>
-              <w:left w:val="single" w:color="CBD5E1" w:sz="1"/>
-              <w:bottom w:val="single" w:color="CBD5E1" w:sz="1"/>
-              <w:right w:val="single" w:color="CBD5E1" w:sz="1"/>
-            </w:tcBorders>
-            <w:tcMar>
-              <w:top w:type="dxa" w:w="60"/>
-              <w:left w:type="dxa" w:w="100"/>
-              <w:bottom w:type="dxa" w:w="60"/>
-              <w:right w:type="dxa" w:w="100"/>
-            </w:tcMar>
-          </w:tcPr>
-          <w:p>
-            <w:r>
-              <w:rPr>
-                <w:rFonts w:ascii="Calibri" w:cs="Calibri" w:eastAsia="Calibri" w:hAnsi="Calibri"/>
-                <w:sz w:val="20"/>
-                <w:szCs w:val="20"/>
-              </w:rPr>
-              <w:t xml:space="preserve">“If the companion looks overwhelmed, what would help it settle?”</w:t>
+              <w:t xml:space="preserve">Reflection question</w:t>
+            </w:r>
+          </w:p>
+        </w:tc>
+        <w:tc>
+          <w:tcPr>
+            <w:tcW w:type="dxa" w:w="6986"/>
+            <w:tcBorders>
+              <w:top w:val="single" w:color="CBD5E1" w:sz="1"/>
+              <w:left w:val="single" w:color="CBD5E1" w:sz="1"/>
+              <w:bottom w:val="single" w:color="CBD5E1" w:sz="1"/>
+              <w:right w:val="single" w:color="CBD5E1" w:sz="1"/>
+            </w:tcBorders>
+            <w:tcMar>
+              <w:top w:type="dxa" w:w="60"/>
+              <w:left w:type="dxa" w:w="100"/>
+              <w:bottom w:type="dxa" w:w="60"/>
+              <w:right w:type="dxa" w:w="100"/>
+            </w:tcMar>
+          </w:tcPr>
+          <w:p>
+            <w:r>
+              <w:rPr>
+                <w:rFonts w:ascii="Calibri" w:cs="Calibri" w:eastAsia="Calibri" w:hAnsi="Calibri"/>
+                <w:sz w:val="20"/>
+                <w:szCs w:val="20"/>
+              </w:rPr>
+              <w:t xml:space="preserve">“What stayed the same in both views, even though they looked different?”</w:t>
             </w:r>
           </w:p>
         </w:tc>
@@ -1125,7 +1576,7 @@
                 <w:sz w:val="20"/>
                 <w:szCs w:val="20"/>
               </w:rPr>
-              <w:t xml:space="preserve">One reflection line about a feeling and a helpful response.</w:t>
+              <w:t xml:space="preserve">One partner explanation naming a shared feature across two representations.</w:t>
             </w:r>
           </w:p>
         </w:tc>
@@ -1155,6 +1606,62 @@
                 <w:sz w:val="20"/>
                 <w:szCs w:val="20"/>
               </w:rPr>
+              <w:t xml:space="preserve">Stopping point</w:t>
+            </w:r>
+          </w:p>
+        </w:tc>
+        <w:tc>
+          <w:tcPr>
+            <w:tcW w:type="dxa" w:w="6986"/>
+            <w:tcBorders>
+              <w:top w:val="single" w:color="CBD5E1" w:sz="1"/>
+              <w:left w:val="single" w:color="CBD5E1" w:sz="1"/>
+              <w:bottom w:val="single" w:color="CBD5E1" w:sz="1"/>
+              <w:right w:val="single" w:color="CBD5E1" w:sz="1"/>
+            </w:tcBorders>
+            <w:tcMar>
+              <w:top w:type="dxa" w:w="60"/>
+              <w:left w:type="dxa" w:w="100"/>
+              <w:bottom w:type="dxa" w:w="60"/>
+              <w:right w:type="dxa" w:w="100"/>
+            </w:tcMar>
+          </w:tcPr>
+          <w:p>
+            <w:r>
+              <w:rPr>
+                <w:rFonts w:ascii="Calibri" w:cs="Calibri" w:eastAsia="Calibri" w:hAnsi="Calibri"/>
+                <w:sz w:val="20"/>
+                <w:szCs w:val="20"/>
+              </w:rPr>
+              <w:t xml:space="preserve">Session Three ends once the class has agreed on one thing that stayed the same.</w:t>
+            </w:r>
+          </w:p>
+        </w:tc>
+      </w:tr>
+      <w:tr>
+        <w:tc>
+          <w:tcPr>
+            <w:tcW w:type="dxa" w:w="2400"/>
+            <w:tcBorders>
+              <w:top w:val="single" w:color="CBD5E1" w:sz="1"/>
+              <w:left w:val="single" w:color="CBD5E1" w:sz="1"/>
+              <w:bottom w:val="single" w:color="CBD5E1" w:sz="1"/>
+              <w:right w:val="single" w:color="CBD5E1" w:sz="1"/>
+            </w:tcBorders>
+            <w:tcMar>
+              <w:top w:type="dxa" w:w="60"/>
+              <w:left w:type="dxa" w:w="100"/>
+              <w:bottom w:type="dxa" w:w="60"/>
+              <w:right w:type="dxa" w:w="100"/>
+            </w:tcMar>
+          </w:tcPr>
+          <w:p>
+            <w:r>
+              <w:rPr>
+                <w:rFonts w:ascii="Calibri" w:cs="Calibri" w:eastAsia="Calibri" w:hAnsi="Calibri"/>
+                <w:sz w:val="20"/>
+                <w:szCs w:val="20"/>
+              </w:rPr>
               <w:t xml:space="preserve">Best-fit use case</w:t>
             </w:r>
           </w:p>
@@ -1182,7 +1689,7 @@
                 <w:sz w:val="20"/>
                 <w:szCs w:val="20"/>
               </w:rPr>
-              <w:t xml:space="preserve">Wellbeing session</w:t>
+              <w:t xml:space="preserve">Digital Technologies mini-lesson</w:t>
             </w:r>
           </w:p>
         </w:tc>
@@ -1198,7 +1705,7 @@
         <w:pStyle w:val="Heading3"/>
       </w:pPr>
       <w:r>
-        <w:t xml:space="preserve">Session 4: Repair and Reset</w:t>
+        <w:t xml:space="preserve">Session 4: Choices and Algorithms</w:t>
       </w:r>
     </w:p>
     <w:tbl>
@@ -1302,48 +1809,105 @@
                 <w:sz w:val="20"/>
                 <w:szCs w:val="20"/>
               </w:rPr>
-              <w:t xml:space="preserve">Clear outcome</w:t>
-            </w:r>
-          </w:p>
-        </w:tc>
-        <w:tc>
-          <w:tcPr>
-            <w:tcW w:type="dxa" w:w="6986"/>
-            <w:tcBorders>
-              <w:top w:val="single" w:color="CBD5E1" w:sz="1"/>
-              <w:left w:val="single" w:color="CBD5E1" w:sz="1"/>
-              <w:bottom w:val="single" w:color="CBD5E1" w:sz="1"/>
-              <w:right w:val="single" w:color="CBD5E1" w:sz="1"/>
-            </w:tcBorders>
-            <w:tcMar>
-              <w:top w:type="dxa" w:w="60"/>
-              <w:left w:type="dxa" w:w="100"/>
-              <w:bottom w:type="dxa" w:w="60"/>
-              <w:right w:type="dxa" w:w="100"/>
-            </w:tcMar>
-          </w:tcPr>
-          <w:p>
-            <w:r>
-              <w:rPr>
-                <w:rFonts w:ascii="Calibri" w:cs="Calibri" w:eastAsia="Calibri" w:hAnsi="Calibri"/>
-                <w:sz w:val="20"/>
-                <w:szCs w:val="20"/>
-              </w:rPr>
-              <w:t xml:space="preserve">Students explain that recovery in a system is a skill, not a punishment.</w:t>
-            </w:r>
-          </w:p>
-        </w:tc>
-      </w:tr>
-      <w:tr>
-        <w:tc>
-          <w:tcPr>
-            <w:tcW w:type="dxa" w:w="2400"/>
-            <w:tcBorders>
-              <w:top w:val="single" w:color="CBD5E1" w:sz="1"/>
-              <w:left w:val="single" w:color="CBD5E1" w:sz="1"/>
-              <w:bottom w:val="single" w:color="CBD5E1" w:sz="1"/>
-              <w:right w:val="single" w:color="CBD5E1" w:sz="1"/>
-            </w:tcBorders>
+              <w:t xml:space="preserve">Learning intention</w:t>
+            </w:r>
+          </w:p>
+        </w:tc>
+        <w:tc>
+          <w:tcPr>
+            <w:tcW w:type="dxa" w:w="6986"/>
+            <w:tcBorders>
+              <w:top w:val="single" w:color="CBD5E1" w:sz="1"/>
+              <w:left w:val="single" w:color="CBD5E1" w:sz="1"/>
+              <w:bottom w:val="single" w:color="CBD5E1" w:sz="1"/>
+              <w:right w:val="single" w:color="CBD5E1" w:sz="1"/>
+            </w:tcBorders>
+            <w:tcMar>
+              <w:top w:type="dxa" w:w="60"/>
+              <w:left w:type="dxa" w:w="100"/>
+              <w:bottom w:type="dxa" w:w="60"/>
+              <w:right w:type="dxa" w:w="100"/>
+            </w:tcMar>
+          </w:tcPr>
+          <w:p>
+            <w:r>
+              <w:rPr>
+                <w:rFonts w:ascii="Calibri" w:cs="Calibri" w:eastAsia="Calibri" w:hAnsi="Calibri"/>
+                <w:sz w:val="20"/>
+                <w:szCs w:val="20"/>
+              </w:rPr>
+              <w:t xml:space="preserve">I can describe a simple if–then rule and predict what it will do.</w:t>
+            </w:r>
+          </w:p>
+        </w:tc>
+      </w:tr>
+      <w:tr>
+        <w:tc>
+          <w:tcPr>
+            <w:tcW w:type="dxa" w:w="2400"/>
+            <w:tcBorders>
+              <w:top w:val="single" w:color="CBD5E1" w:sz="1"/>
+              <w:left w:val="single" w:color="CBD5E1" w:sz="1"/>
+              <w:bottom w:val="single" w:color="CBD5E1" w:sz="1"/>
+              <w:right w:val="single" w:color="CBD5E1" w:sz="1"/>
+            </w:tcBorders>
+            <w:tcMar>
+              <w:top w:type="dxa" w:w="60"/>
+              <w:left w:type="dxa" w:w="100"/>
+              <w:bottom w:type="dxa" w:w="60"/>
+              <w:right w:type="dxa" w:w="100"/>
+            </w:tcMar>
+          </w:tcPr>
+          <w:p>
+            <w:r>
+              <w:rPr>
+                <w:rFonts w:ascii="Calibri" w:cs="Calibri" w:eastAsia="Calibri" w:hAnsi="Calibri"/>
+                <w:sz w:val="20"/>
+                <w:szCs w:val="20"/>
+              </w:rPr>
+              <w:t xml:space="preserve">Teacher introduction</w:t>
+            </w:r>
+          </w:p>
+        </w:tc>
+        <w:tc>
+          <w:tcPr>
+            <w:tcW w:type="dxa" w:w="6986"/>
+            <w:tcBorders>
+              <w:top w:val="single" w:color="CBD5E1" w:sz="1"/>
+              <w:left w:val="single" w:color="CBD5E1" w:sz="1"/>
+              <w:bottom w:val="single" w:color="CBD5E1" w:sz="1"/>
+              <w:right w:val="single" w:color="CBD5E1" w:sz="1"/>
+            </w:tcBorders>
+            <w:tcMar>
+              <w:top w:type="dxa" w:w="60"/>
+              <w:left w:type="dxa" w:w="100"/>
+              <w:bottom w:type="dxa" w:w="60"/>
+              <w:right w:type="dxa" w:w="100"/>
+            </w:tcMar>
+          </w:tcPr>
+          <w:p>
+            <w:r>
+              <w:rPr>
+                <w:rFonts w:ascii="Calibri" w:cs="Calibri" w:eastAsia="Calibri" w:hAnsi="Calibri"/>
+                <w:sz w:val="20"/>
+                <w:szCs w:val="20"/>
+              </w:rPr>
+              <w:t xml:space="preserve">Predict first, then act. When a sequence goes badly, reset and try a different order — recovering is part of the method, never a punishment. That reset is the feedback loop students are learning to see.</w:t>
+            </w:r>
+          </w:p>
+        </w:tc>
+      </w:tr>
+      <w:tr>
+        <w:tc>
+          <w:tcPr>
+            <w:tcW w:type="dxa" w:w="2400"/>
+            <w:tcBorders>
+              <w:top w:val="single" w:color="CBD5E1" w:sz="1"/>
+              <w:left w:val="single" w:color="CBD5E1" w:sz="1"/>
+              <w:bottom w:val="single" w:color="CBD5E1" w:sz="1"/>
+              <w:right w:val="single" w:color="CBD5E1" w:sz="1"/>
+            </w:tcBorders>
+            <w:shd w:fill="F1F5F9" w:val="clear"/>
             <w:tcMar>
               <w:top w:type="dxa" w:w="60"/>
               <w:left w:type="dxa" w:w="100"/>
@@ -1385,7 +1949,63 @@
                 <w:sz w:val="20"/>
                 <w:szCs w:val="20"/>
               </w:rPr>
-              <w:t xml:space="preserve">Start from an unstable companion state, test a repair sequence, and compare which order of actions works best.</w:t>
+              <w:t xml:space="preserve">Predict what one action will do, try it, then reset and try a different order.</w:t>
+            </w:r>
+          </w:p>
+        </w:tc>
+      </w:tr>
+      <w:tr>
+        <w:tc>
+          <w:tcPr>
+            <w:tcW w:type="dxa" w:w="2400"/>
+            <w:tcBorders>
+              <w:top w:val="single" w:color="CBD5E1" w:sz="1"/>
+              <w:left w:val="single" w:color="CBD5E1" w:sz="1"/>
+              <w:bottom w:val="single" w:color="CBD5E1" w:sz="1"/>
+              <w:right w:val="single" w:color="CBD5E1" w:sz="1"/>
+            </w:tcBorders>
+            <w:tcMar>
+              <w:top w:type="dxa" w:w="60"/>
+              <w:left w:type="dxa" w:w="100"/>
+              <w:bottom w:type="dxa" w:w="60"/>
+              <w:right w:type="dxa" w:w="100"/>
+            </w:tcMar>
+          </w:tcPr>
+          <w:p>
+            <w:r>
+              <w:rPr>
+                <w:rFonts w:ascii="Calibri" w:cs="Calibri" w:eastAsia="Calibri" w:hAnsi="Calibri"/>
+                <w:sz w:val="20"/>
+                <w:szCs w:val="20"/>
+              </w:rPr>
+              <w:t xml:space="preserve">Movement moment</w:t>
+            </w:r>
+          </w:p>
+        </w:tc>
+        <w:tc>
+          <w:tcPr>
+            <w:tcW w:type="dxa" w:w="6986"/>
+            <w:tcBorders>
+              <w:top w:val="single" w:color="CBD5E1" w:sz="1"/>
+              <w:left w:val="single" w:color="CBD5E1" w:sz="1"/>
+              <w:bottom w:val="single" w:color="CBD5E1" w:sz="1"/>
+              <w:right w:val="single" w:color="CBD5E1" w:sz="1"/>
+            </w:tcBorders>
+            <w:tcMar>
+              <w:top w:type="dxa" w:w="60"/>
+              <w:left w:type="dxa" w:w="100"/>
+              <w:bottom w:type="dxa" w:w="60"/>
+              <w:right w:type="dxa" w:w="100"/>
+            </w:tcMar>
+          </w:tcPr>
+          <w:p>
+            <w:r>
+              <w:rPr>
+                <w:rFonts w:ascii="Calibri" w:cs="Calibri" w:eastAsia="Calibri" w:hAnsi="Calibri"/>
+                <w:sz w:val="20"/>
+                <w:szCs w:val="20"/>
+              </w:rPr>
+              <w:t xml:space="preserve">Act out the if–then rule as a class: hands up for "if", step forward for "then".</w:t>
             </w:r>
           </w:p>
         </w:tc>
@@ -1415,34 +2035,34 @@
                 <w:sz w:val="20"/>
                 <w:szCs w:val="20"/>
               </w:rPr>
-              <w:t xml:space="preserve">Teacher prompt</w:t>
-            </w:r>
-          </w:p>
-        </w:tc>
-        <w:tc>
-          <w:tcPr>
-            <w:tcW w:type="dxa" w:w="6986"/>
-            <w:tcBorders>
-              <w:top w:val="single" w:color="CBD5E1" w:sz="1"/>
-              <w:left w:val="single" w:color="CBD5E1" w:sz="1"/>
-              <w:bottom w:val="single" w:color="CBD5E1" w:sz="1"/>
-              <w:right w:val="single" w:color="CBD5E1" w:sz="1"/>
-            </w:tcBorders>
-            <w:tcMar>
-              <w:top w:type="dxa" w:w="60"/>
-              <w:left w:type="dxa" w:w="100"/>
-              <w:bottom w:type="dxa" w:w="60"/>
-              <w:right w:type="dxa" w:w="100"/>
-            </w:tcMar>
-          </w:tcPr>
-          <w:p>
-            <w:r>
-              <w:rPr>
-                <w:rFonts w:ascii="Calibri" w:cs="Calibri" w:eastAsia="Calibri" w:hAnsi="Calibri"/>
-                <w:sz w:val="20"/>
-                <w:szCs w:val="20"/>
-              </w:rPr>
-              <w:t xml:space="preserve">“What helped the system recover, and why did that order matter?”</w:t>
+              <w:t xml:space="preserve">Reflection question</w:t>
+            </w:r>
+          </w:p>
+        </w:tc>
+        <w:tc>
+          <w:tcPr>
+            <w:tcW w:type="dxa" w:w="6986"/>
+            <w:tcBorders>
+              <w:top w:val="single" w:color="CBD5E1" w:sz="1"/>
+              <w:left w:val="single" w:color="CBD5E1" w:sz="1"/>
+              <w:bottom w:val="single" w:color="CBD5E1" w:sz="1"/>
+              <w:right w:val="single" w:color="CBD5E1" w:sz="1"/>
+            </w:tcBorders>
+            <w:tcMar>
+              <w:top w:type="dxa" w:w="60"/>
+              <w:left w:type="dxa" w:w="100"/>
+              <w:bottom w:type="dxa" w:w="60"/>
+              <w:right w:type="dxa" w:w="100"/>
+            </w:tcMar>
+          </w:tcPr>
+          <w:p>
+            <w:r>
+              <w:rPr>
+                <w:rFonts w:ascii="Calibri" w:cs="Calibri" w:eastAsia="Calibri" w:hAnsi="Calibri"/>
+                <w:sz w:val="20"/>
+                <w:szCs w:val="20"/>
+              </w:rPr>
+              <w:t xml:space="preserve">“Which order worked better, and what makes you say that?”</w:t>
             </w:r>
           </w:p>
         </w:tc>
@@ -1498,7 +2118,7 @@
                 <w:sz w:val="20"/>
                 <w:szCs w:val="20"/>
               </w:rPr>
-              <w:t xml:space="preserve">Short verbal explanation or checklist note about the recovery sequence.</w:t>
+              <w:t xml:space="preserve">One short input → change → result note per pair.</w:t>
             </w:r>
           </w:p>
         </w:tc>
@@ -1528,6 +2148,62 @@
                 <w:sz w:val="20"/>
                 <w:szCs w:val="20"/>
               </w:rPr>
+              <w:t xml:space="preserve">Stopping point</w:t>
+            </w:r>
+          </w:p>
+        </w:tc>
+        <w:tc>
+          <w:tcPr>
+            <w:tcW w:type="dxa" w:w="6986"/>
+            <w:tcBorders>
+              <w:top w:val="single" w:color="CBD5E1" w:sz="1"/>
+              <w:left w:val="single" w:color="CBD5E1" w:sz="1"/>
+              <w:bottom w:val="single" w:color="CBD5E1" w:sz="1"/>
+              <w:right w:val="single" w:color="CBD5E1" w:sz="1"/>
+            </w:tcBorders>
+            <w:tcMar>
+              <w:top w:type="dxa" w:w="60"/>
+              <w:left w:type="dxa" w:w="100"/>
+              <w:bottom w:type="dxa" w:w="60"/>
+              <w:right w:type="dxa" w:w="100"/>
+            </w:tcMar>
+          </w:tcPr>
+          <w:p>
+            <w:r>
+              <w:rPr>
+                <w:rFonts w:ascii="Calibri" w:cs="Calibri" w:eastAsia="Calibri" w:hAnsi="Calibri"/>
+                <w:sz w:val="20"/>
+                <w:szCs w:val="20"/>
+              </w:rPr>
+              <w:t xml:space="preserve">Session Four ends after the class compares two orders. The demonstration resets.</w:t>
+            </w:r>
+          </w:p>
+        </w:tc>
+      </w:tr>
+      <w:tr>
+        <w:tc>
+          <w:tcPr>
+            <w:tcW w:type="dxa" w:w="2400"/>
+            <w:tcBorders>
+              <w:top w:val="single" w:color="CBD5E1" w:sz="1"/>
+              <w:left w:val="single" w:color="CBD5E1" w:sz="1"/>
+              <w:bottom w:val="single" w:color="CBD5E1" w:sz="1"/>
+              <w:right w:val="single" w:color="CBD5E1" w:sz="1"/>
+            </w:tcBorders>
+            <w:tcMar>
+              <w:top w:type="dxa" w:w="60"/>
+              <w:left w:type="dxa" w:w="100"/>
+              <w:bottom w:type="dxa" w:w="60"/>
+              <w:right w:type="dxa" w:w="100"/>
+            </w:tcMar>
+          </w:tcPr>
+          <w:p>
+            <w:r>
+              <w:rPr>
+                <w:rFonts w:ascii="Calibri" w:cs="Calibri" w:eastAsia="Calibri" w:hAnsi="Calibri"/>
+                <w:sz w:val="20"/>
+                <w:szCs w:val="20"/>
+              </w:rPr>
               <w:t xml:space="preserve">Best-fit use case</w:t>
             </w:r>
           </w:p>
@@ -1555,7 +2231,7 @@
                 <w:sz w:val="20"/>
                 <w:szCs w:val="20"/>
               </w:rPr>
-              <w:t xml:space="preserve">Wellbeing session or relief lesson</w:t>
+              <w:t xml:space="preserve">STEM block</w:t>
             </w:r>
           </w:p>
         </w:tc>
@@ -1571,7 +2247,7 @@
         <w:pStyle w:val="Heading3"/>
       </w:pPr>
       <w:r>
-        <w:t xml:space="preserve">Session 5: Systems and Feedback Loops</w:t>
+        <w:t xml:space="preserve">Session 5: Privacy and Responsible Design</w:t>
       </w:r>
     </w:p>
     <w:tbl>
@@ -1675,48 +2351,105 @@
                 <w:sz w:val="20"/>
                 <w:szCs w:val="20"/>
               </w:rPr>
-              <w:t xml:space="preserve">Clear outcome</w:t>
-            </w:r>
-          </w:p>
-        </w:tc>
-        <w:tc>
-          <w:tcPr>
-            <w:tcW w:type="dxa" w:w="6986"/>
-            <w:tcBorders>
-              <w:top w:val="single" w:color="CBD5E1" w:sz="1"/>
-              <w:left w:val="single" w:color="CBD5E1" w:sz="1"/>
-              <w:bottom w:val="single" w:color="CBD5E1" w:sz="1"/>
-              <w:right w:val="single" w:color="CBD5E1" w:sz="1"/>
-            </w:tcBorders>
-            <w:tcMar>
-              <w:top w:type="dxa" w:w="60"/>
-              <w:left w:type="dxa" w:w="100"/>
-              <w:bottom w:type="dxa" w:w="60"/>
-              <w:right w:type="dxa" w:w="100"/>
-            </w:tcMar>
-          </w:tcPr>
-          <w:p>
-            <w:r>
-              <w:rPr>
-                <w:rFonts w:ascii="Calibri" w:cs="Calibri" w:eastAsia="Calibri" w:hAnsi="Calibri"/>
-                <w:sz w:val="20"/>
-                <w:szCs w:val="20"/>
-              </w:rPr>
-              <w:t xml:space="preserve">Students describe a simple feedback loop using system language.</w:t>
-            </w:r>
-          </w:p>
-        </w:tc>
-      </w:tr>
-      <w:tr>
-        <w:tc>
-          <w:tcPr>
-            <w:tcW w:type="dxa" w:w="2400"/>
-            <w:tcBorders>
-              <w:top w:val="single" w:color="CBD5E1" w:sz="1"/>
-              <w:left w:val="single" w:color="CBD5E1" w:sz="1"/>
-              <w:bottom w:val="single" w:color="CBD5E1" w:sz="1"/>
-              <w:right w:val="single" w:color="CBD5E1" w:sz="1"/>
-            </w:tcBorders>
+              <w:t xml:space="preserve">Learning intention</w:t>
+            </w:r>
+          </w:p>
+        </w:tc>
+        <w:tc>
+          <w:tcPr>
+            <w:tcW w:type="dxa" w:w="6986"/>
+            <w:tcBorders>
+              <w:top w:val="single" w:color="CBD5E1" w:sz="1"/>
+              <w:left w:val="single" w:color="CBD5E1" w:sz="1"/>
+              <w:bottom w:val="single" w:color="CBD5E1" w:sz="1"/>
+              <w:right w:val="single" w:color="CBD5E1" w:sz="1"/>
+            </w:tcBorders>
+            <w:tcMar>
+              <w:top w:type="dxa" w:w="60"/>
+              <w:left w:type="dxa" w:w="100"/>
+              <w:bottom w:type="dxa" w:w="60"/>
+              <w:right w:type="dxa" w:w="100"/>
+            </w:tcMar>
+          </w:tcPr>
+          <w:p>
+            <w:r>
+              <w:rPr>
+                <w:rFonts w:ascii="Calibri" w:cs="Calibri" w:eastAsia="Calibri" w:hAnsi="Calibri"/>
+                <w:sz w:val="20"/>
+                <w:szCs w:val="20"/>
+              </w:rPr>
+              <w:t xml:space="preserve">I can decide what a system should and should not keep, and give a reason.</w:t>
+            </w:r>
+          </w:p>
+        </w:tc>
+      </w:tr>
+      <w:tr>
+        <w:tc>
+          <w:tcPr>
+            <w:tcW w:type="dxa" w:w="2400"/>
+            <w:tcBorders>
+              <w:top w:val="single" w:color="CBD5E1" w:sz="1"/>
+              <w:left w:val="single" w:color="CBD5E1" w:sz="1"/>
+              <w:bottom w:val="single" w:color="CBD5E1" w:sz="1"/>
+              <w:right w:val="single" w:color="CBD5E1" w:sz="1"/>
+            </w:tcBorders>
+            <w:tcMar>
+              <w:top w:type="dxa" w:w="60"/>
+              <w:left w:type="dxa" w:w="100"/>
+              <w:bottom w:type="dxa" w:w="60"/>
+              <w:right w:type="dxa" w:w="100"/>
+            </w:tcMar>
+          </w:tcPr>
+          <w:p>
+            <w:r>
+              <w:rPr>
+                <w:rFonts w:ascii="Calibri" w:cs="Calibri" w:eastAsia="Calibri" w:hAnsi="Calibri"/>
+                <w:sz w:val="20"/>
+                <w:szCs w:val="20"/>
+              </w:rPr>
+              <w:t xml:space="preserve">Teacher introduction</w:t>
+            </w:r>
+          </w:p>
+        </w:tc>
+        <w:tc>
+          <w:tcPr>
+            <w:tcW w:type="dxa" w:w="6986"/>
+            <w:tcBorders>
+              <w:top w:val="single" w:color="CBD5E1" w:sz="1"/>
+              <w:left w:val="single" w:color="CBD5E1" w:sz="1"/>
+              <w:bottom w:val="single" w:color="CBD5E1" w:sz="1"/>
+              <w:right w:val="single" w:color="CBD5E1" w:sz="1"/>
+            </w:tcBorders>
+            <w:tcMar>
+              <w:top w:type="dxa" w:w="60"/>
+              <w:left w:type="dxa" w:w="100"/>
+              <w:bottom w:type="dxa" w:w="60"/>
+              <w:right w:type="dxa" w:w="100"/>
+            </w:tcMar>
+          </w:tcPr>
+          <w:p>
+            <w:r>
+              <w:rPr>
+                <w:rFonts w:ascii="Calibri" w:cs="Calibri" w:eastAsia="Calibri" w:hAnsi="Calibri"/>
+                <w:sz w:val="20"/>
+                <w:szCs w:val="20"/>
+              </w:rPr>
+              <w:t xml:space="preserve">Keep this concrete. Students sort real examples into keep, ask first and never. The point is that someone chose — systems do not decide on their own what to remember.</w:t>
+            </w:r>
+          </w:p>
+        </w:tc>
+      </w:tr>
+      <w:tr>
+        <w:tc>
+          <w:tcPr>
+            <w:tcW w:type="dxa" w:w="2400"/>
+            <w:tcBorders>
+              <w:top w:val="single" w:color="CBD5E1" w:sz="1"/>
+              <w:left w:val="single" w:color="CBD5E1" w:sz="1"/>
+              <w:bottom w:val="single" w:color="CBD5E1" w:sz="1"/>
+              <w:right w:val="single" w:color="CBD5E1" w:sz="1"/>
+            </w:tcBorders>
+            <w:shd w:fill="F1F5F9" w:val="clear"/>
             <w:tcMar>
               <w:top w:type="dxa" w:w="60"/>
               <w:left w:type="dxa" w:w="100"/>
@@ -1758,7 +2491,63 @@
                 <w:sz w:val="20"/>
                 <w:szCs w:val="20"/>
               </w:rPr>
-              <w:t xml:space="preserve">Track one input, one state change, and one resulting mood or output.</w:t>
+              <w:t xml:space="preserve">Sort what a system should keep, should ask about, and should never keep.</w:t>
+            </w:r>
+          </w:p>
+        </w:tc>
+      </w:tr>
+      <w:tr>
+        <w:tc>
+          <w:tcPr>
+            <w:tcW w:type="dxa" w:w="2400"/>
+            <w:tcBorders>
+              <w:top w:val="single" w:color="CBD5E1" w:sz="1"/>
+              <w:left w:val="single" w:color="CBD5E1" w:sz="1"/>
+              <w:bottom w:val="single" w:color="CBD5E1" w:sz="1"/>
+              <w:right w:val="single" w:color="CBD5E1" w:sz="1"/>
+            </w:tcBorders>
+            <w:tcMar>
+              <w:top w:type="dxa" w:w="60"/>
+              <w:left w:type="dxa" w:w="100"/>
+              <w:bottom w:type="dxa" w:w="60"/>
+              <w:right w:type="dxa" w:w="100"/>
+            </w:tcMar>
+          </w:tcPr>
+          <w:p>
+            <w:r>
+              <w:rPr>
+                <w:rFonts w:ascii="Calibri" w:cs="Calibri" w:eastAsia="Calibri" w:hAnsi="Calibri"/>
+                <w:sz w:val="20"/>
+                <w:szCs w:val="20"/>
+              </w:rPr>
+              <w:t xml:space="preserve">Movement moment</w:t>
+            </w:r>
+          </w:p>
+        </w:tc>
+        <w:tc>
+          <w:tcPr>
+            <w:tcW w:type="dxa" w:w="6986"/>
+            <w:tcBorders>
+              <w:top w:val="single" w:color="CBD5E1" w:sz="1"/>
+              <w:left w:val="single" w:color="CBD5E1" w:sz="1"/>
+              <w:bottom w:val="single" w:color="CBD5E1" w:sz="1"/>
+              <w:right w:val="single" w:color="CBD5E1" w:sz="1"/>
+            </w:tcBorders>
+            <w:tcMar>
+              <w:top w:type="dxa" w:w="60"/>
+              <w:left w:type="dxa" w:w="100"/>
+              <w:bottom w:type="dxa" w:w="60"/>
+              <w:right w:type="dxa" w:w="100"/>
+            </w:tcMar>
+          </w:tcPr>
+          <w:p>
+            <w:r>
+              <w:rPr>
+                <w:rFonts w:ascii="Calibri" w:cs="Calibri" w:eastAsia="Calibri" w:hAnsi="Calibri"/>
+                <w:sz w:val="20"/>
+                <w:szCs w:val="20"/>
+              </w:rPr>
+              <w:t xml:space="preserve">Move to a corner of the room for keep, ask first or never, then explain your corner.</w:t>
             </w:r>
           </w:p>
         </w:tc>
@@ -1788,34 +2577,34 @@
                 <w:sz w:val="20"/>
                 <w:szCs w:val="20"/>
               </w:rPr>
-              <w:t xml:space="preserve">Teacher prompt</w:t>
-            </w:r>
-          </w:p>
-        </w:tc>
-        <w:tc>
-          <w:tcPr>
-            <w:tcW w:type="dxa" w:w="6986"/>
-            <w:tcBorders>
-              <w:top w:val="single" w:color="CBD5E1" w:sz="1"/>
-              <w:left w:val="single" w:color="CBD5E1" w:sz="1"/>
-              <w:bottom w:val="single" w:color="CBD5E1" w:sz="1"/>
-              <w:right w:val="single" w:color="CBD5E1" w:sz="1"/>
-            </w:tcBorders>
-            <w:tcMar>
-              <w:top w:type="dxa" w:w="60"/>
-              <w:left w:type="dxa" w:w="100"/>
-              <w:bottom w:type="dxa" w:w="60"/>
-              <w:right w:type="dxa" w:w="100"/>
-            </w:tcMar>
-          </w:tcPr>
-          <w:p>
-            <w:r>
-              <w:rPr>
-                <w:rFonts w:ascii="Calibri" w:cs="Calibri" w:eastAsia="Calibri" w:hAnsi="Calibri"/>
-                <w:sz w:val="20"/>
-                <w:szCs w:val="20"/>
-              </w:rPr>
-              <w:t xml:space="preserve">“What signal did the system give you after your first action?”</w:t>
+              <w:t xml:space="preserve">Reflection question</w:t>
+            </w:r>
+          </w:p>
+        </w:tc>
+        <w:tc>
+          <w:tcPr>
+            <w:tcW w:type="dxa" w:w="6986"/>
+            <w:tcBorders>
+              <w:top w:val="single" w:color="CBD5E1" w:sz="1"/>
+              <w:left w:val="single" w:color="CBD5E1" w:sz="1"/>
+              <w:bottom w:val="single" w:color="CBD5E1" w:sz="1"/>
+              <w:right w:val="single" w:color="CBD5E1" w:sz="1"/>
+            </w:tcBorders>
+            <w:tcMar>
+              <w:top w:type="dxa" w:w="60"/>
+              <w:left w:type="dxa" w:w="100"/>
+              <w:bottom w:type="dxa" w:w="60"/>
+              <w:right w:type="dxa" w:w="100"/>
+            </w:tcMar>
+          </w:tcPr>
+          <w:p>
+            <w:r>
+              <w:rPr>
+                <w:rFonts w:ascii="Calibri" w:cs="Calibri" w:eastAsia="Calibri" w:hAnsi="Calibri"/>
+                <w:sz w:val="20"/>
+                <w:szCs w:val="20"/>
+              </w:rPr>
+              <w:t xml:space="preserve">“Who should get to decide what a system remembers about you?”</w:t>
             </w:r>
           </w:p>
         </w:tc>
@@ -1871,7 +2660,7 @@
                 <w:sz w:val="20"/>
                 <w:szCs w:val="20"/>
               </w:rPr>
-              <w:t xml:space="preserve">Input → state → output summary.</w:t>
+              <w:t xml:space="preserve">One design rule per group, in the students' own words.</w:t>
             </w:r>
           </w:p>
         </w:tc>
@@ -1901,6 +2690,62 @@
                 <w:sz w:val="20"/>
                 <w:szCs w:val="20"/>
               </w:rPr>
+              <w:t xml:space="preserve">Stopping point</w:t>
+            </w:r>
+          </w:p>
+        </w:tc>
+        <w:tc>
+          <w:tcPr>
+            <w:tcW w:type="dxa" w:w="6986"/>
+            <w:tcBorders>
+              <w:top w:val="single" w:color="CBD5E1" w:sz="1"/>
+              <w:left w:val="single" w:color="CBD5E1" w:sz="1"/>
+              <w:bottom w:val="single" w:color="CBD5E1" w:sz="1"/>
+              <w:right w:val="single" w:color="CBD5E1" w:sz="1"/>
+            </w:tcBorders>
+            <w:tcMar>
+              <w:top w:type="dxa" w:w="60"/>
+              <w:left w:type="dxa" w:w="100"/>
+              <w:bottom w:type="dxa" w:w="60"/>
+              <w:right w:type="dxa" w:w="100"/>
+            </w:tcMar>
+          </w:tcPr>
+          <w:p>
+            <w:r>
+              <w:rPr>
+                <w:rFonts w:ascii="Calibri" w:cs="Calibri" w:eastAsia="Calibri" w:hAnsi="Calibri"/>
+                <w:sz w:val="20"/>
+                <w:szCs w:val="20"/>
+              </w:rPr>
+              <w:t xml:space="preserve">Session Five ends after each group states one rule they would give a designer.</w:t>
+            </w:r>
+          </w:p>
+        </w:tc>
+      </w:tr>
+      <w:tr>
+        <w:tc>
+          <w:tcPr>
+            <w:tcW w:type="dxa" w:w="2400"/>
+            <w:tcBorders>
+              <w:top w:val="single" w:color="CBD5E1" w:sz="1"/>
+              <w:left w:val="single" w:color="CBD5E1" w:sz="1"/>
+              <w:bottom w:val="single" w:color="CBD5E1" w:sz="1"/>
+              <w:right w:val="single" w:color="CBD5E1" w:sz="1"/>
+            </w:tcBorders>
+            <w:tcMar>
+              <w:top w:type="dxa" w:w="60"/>
+              <w:left w:type="dxa" w:w="100"/>
+              <w:bottom w:type="dxa" w:w="60"/>
+              <w:right w:type="dxa" w:w="100"/>
+            </w:tcMar>
+          </w:tcPr>
+          <w:p>
+            <w:r>
+              <w:rPr>
+                <w:rFonts w:ascii="Calibri" w:cs="Calibri" w:eastAsia="Calibri" w:hAnsi="Calibri"/>
+                <w:sz w:val="20"/>
+                <w:szCs w:val="20"/>
+              </w:rPr>
               <w:t xml:space="preserve">Best-fit use case</w:t>
             </w:r>
           </w:p>
@@ -1928,7 +2773,7 @@
                 <w:sz w:val="20"/>
                 <w:szCs w:val="20"/>
               </w:rPr>
-              <w:t xml:space="preserve">STEM block</w:t>
+              <w:t xml:space="preserve">Digital citizenship lesson</w:t>
             </w:r>
           </w:p>
         </w:tc>
@@ -1944,7 +2789,7 @@
         <w:pStyle w:val="Heading3"/>
       </w:pPr>
       <w:r>
-        <w:t xml:space="preserve">Session 6: Patterns Over Time</w:t>
+        <w:t xml:space="preserve">Session 6: Design a Better Feature</w:t>
       </w:r>
     </w:p>
     <w:tbl>
@@ -2048,48 +2893,105 @@
                 <w:sz w:val="20"/>
                 <w:szCs w:val="20"/>
               </w:rPr>
-              <w:t xml:space="preserve">Clear outcome</w:t>
-            </w:r>
-          </w:p>
-        </w:tc>
-        <w:tc>
-          <w:tcPr>
-            <w:tcW w:type="dxa" w:w="6986"/>
-            <w:tcBorders>
-              <w:top w:val="single" w:color="CBD5E1" w:sz="1"/>
-              <w:left w:val="single" w:color="CBD5E1" w:sz="1"/>
-              <w:bottom w:val="single" w:color="CBD5E1" w:sz="1"/>
-              <w:right w:val="single" w:color="CBD5E1" w:sz="1"/>
-            </w:tcBorders>
-            <w:tcMar>
-              <w:top w:type="dxa" w:w="60"/>
-              <w:left w:type="dxa" w:w="100"/>
-              <w:bottom w:type="dxa" w:w="60"/>
-              <w:right w:type="dxa" w:w="100"/>
-            </w:tcMar>
-          </w:tcPr>
-          <w:p>
-            <w:r>
-              <w:rPr>
-                <w:rFonts w:ascii="Calibri" w:cs="Calibri" w:eastAsia="Calibri" w:hAnsi="Calibri"/>
-                <w:sz w:val="20"/>
-                <w:szCs w:val="20"/>
-              </w:rPr>
-              <w:t xml:space="preserve">Students identify a pattern in how the companion responds across multiple actions.</w:t>
-            </w:r>
-          </w:p>
-        </w:tc>
-      </w:tr>
-      <w:tr>
-        <w:tc>
-          <w:tcPr>
-            <w:tcW w:type="dxa" w:w="2400"/>
-            <w:tcBorders>
-              <w:top w:val="single" w:color="CBD5E1" w:sz="1"/>
-              <w:left w:val="single" w:color="CBD5E1" w:sz="1"/>
-              <w:bottom w:val="single" w:color="CBD5E1" w:sz="1"/>
-              <w:right w:val="single" w:color="CBD5E1" w:sz="1"/>
-            </w:tcBorders>
+              <w:t xml:space="preserve">Learning intention</w:t>
+            </w:r>
+          </w:p>
+        </w:tc>
+        <w:tc>
+          <w:tcPr>
+            <w:tcW w:type="dxa" w:w="6986"/>
+            <w:tcBorders>
+              <w:top w:val="single" w:color="CBD5E1" w:sz="1"/>
+              <w:left w:val="single" w:color="CBD5E1" w:sz="1"/>
+              <w:bottom w:val="single" w:color="CBD5E1" w:sz="1"/>
+              <w:right w:val="single" w:color="CBD5E1" w:sz="1"/>
+            </w:tcBorders>
+            <w:tcMar>
+              <w:top w:type="dxa" w:w="60"/>
+              <w:left w:type="dxa" w:w="100"/>
+              <w:bottom w:type="dxa" w:w="60"/>
+              <w:right w:type="dxa" w:w="100"/>
+            </w:tcMar>
+          </w:tcPr>
+          <w:p>
+            <w:r>
+              <w:rPr>
+                <w:rFonts w:ascii="Calibri" w:cs="Calibri" w:eastAsia="Calibri" w:hAnsi="Calibri"/>
+                <w:sz w:val="20"/>
+                <w:szCs w:val="20"/>
+              </w:rPr>
+              <w:t xml:space="preserve">I can design one change to a feature and explain who it helps.</w:t>
+            </w:r>
+          </w:p>
+        </w:tc>
+      </w:tr>
+      <w:tr>
+        <w:tc>
+          <w:tcPr>
+            <w:tcW w:type="dxa" w:w="2400"/>
+            <w:tcBorders>
+              <w:top w:val="single" w:color="CBD5E1" w:sz="1"/>
+              <w:left w:val="single" w:color="CBD5E1" w:sz="1"/>
+              <w:bottom w:val="single" w:color="CBD5E1" w:sz="1"/>
+              <w:right w:val="single" w:color="CBD5E1" w:sz="1"/>
+            </w:tcBorders>
+            <w:tcMar>
+              <w:top w:type="dxa" w:w="60"/>
+              <w:left w:type="dxa" w:w="100"/>
+              <w:bottom w:type="dxa" w:w="60"/>
+              <w:right w:type="dxa" w:w="100"/>
+            </w:tcMar>
+          </w:tcPr>
+          <w:p>
+            <w:r>
+              <w:rPr>
+                <w:rFonts w:ascii="Calibri" w:cs="Calibri" w:eastAsia="Calibri" w:hAnsi="Calibri"/>
+                <w:sz w:val="20"/>
+                <w:szCs w:val="20"/>
+              </w:rPr>
+              <w:t xml:space="preserve">Teacher introduction</w:t>
+            </w:r>
+          </w:p>
+        </w:tc>
+        <w:tc>
+          <w:tcPr>
+            <w:tcW w:type="dxa" w:w="6986"/>
+            <w:tcBorders>
+              <w:top w:val="single" w:color="CBD5E1" w:sz="1"/>
+              <w:left w:val="single" w:color="CBD5E1" w:sz="1"/>
+              <w:bottom w:val="single" w:color="CBD5E1" w:sz="1"/>
+              <w:right w:val="single" w:color="CBD5E1" w:sz="1"/>
+            </w:tcBorders>
+            <w:tcMar>
+              <w:top w:type="dxa" w:w="60"/>
+              <w:left w:type="dxa" w:w="100"/>
+              <w:bottom w:type="dxa" w:w="60"/>
+              <w:right w:type="dxa" w:w="100"/>
+            </w:tcMar>
+          </w:tcPr>
+          <w:p>
+            <w:r>
+              <w:rPr>
+                <w:rFonts w:ascii="Calibri" w:cs="Calibri" w:eastAsia="Calibri" w:hAnsi="Calibri"/>
+                <w:sz w:val="20"/>
+                <w:szCs w:val="20"/>
+              </w:rPr>
+              <w:t xml:space="preserve">One change only. The constraint is the teaching: students have to justify a single choice rather than list ten. Ask who it helps and who it might not.</w:t>
+            </w:r>
+          </w:p>
+        </w:tc>
+      </w:tr>
+      <w:tr>
+        <w:tc>
+          <w:tcPr>
+            <w:tcW w:type="dxa" w:w="2400"/>
+            <w:tcBorders>
+              <w:top w:val="single" w:color="CBD5E1" w:sz="1"/>
+              <w:left w:val="single" w:color="CBD5E1" w:sz="1"/>
+              <w:bottom w:val="single" w:color="CBD5E1" w:sz="1"/>
+              <w:right w:val="single" w:color="CBD5E1" w:sz="1"/>
+            </w:tcBorders>
+            <w:shd w:fill="F1F5F9" w:val="clear"/>
             <w:tcMar>
               <w:top w:type="dxa" w:w="60"/>
               <w:left w:type="dxa" w:w="100"/>
@@ -2131,7 +3033,63 @@
                 <w:sz w:val="20"/>
                 <w:szCs w:val="20"/>
               </w:rPr>
-              <w:t xml:space="preserve">Review notes from earlier sessions, compare with a partner, and identify one reliable pattern.</w:t>
+              <w:t xml:space="preserve">Change one part of the design and say who your change helps.</w:t>
+            </w:r>
+          </w:p>
+        </w:tc>
+      </w:tr>
+      <w:tr>
+        <w:tc>
+          <w:tcPr>
+            <w:tcW w:type="dxa" w:w="2400"/>
+            <w:tcBorders>
+              <w:top w:val="single" w:color="CBD5E1" w:sz="1"/>
+              <w:left w:val="single" w:color="CBD5E1" w:sz="1"/>
+              <w:bottom w:val="single" w:color="CBD5E1" w:sz="1"/>
+              <w:right w:val="single" w:color="CBD5E1" w:sz="1"/>
+            </w:tcBorders>
+            <w:tcMar>
+              <w:top w:type="dxa" w:w="60"/>
+              <w:left w:type="dxa" w:w="100"/>
+              <w:bottom w:type="dxa" w:w="60"/>
+              <w:right w:type="dxa" w:w="100"/>
+            </w:tcMar>
+          </w:tcPr>
+          <w:p>
+            <w:r>
+              <w:rPr>
+                <w:rFonts w:ascii="Calibri" w:cs="Calibri" w:eastAsia="Calibri" w:hAnsi="Calibri"/>
+                <w:sz w:val="20"/>
+                <w:szCs w:val="20"/>
+              </w:rPr>
+              <w:t xml:space="preserve">Movement moment</w:t>
+            </w:r>
+          </w:p>
+        </w:tc>
+        <w:tc>
+          <w:tcPr>
+            <w:tcW w:type="dxa" w:w="6986"/>
+            <w:tcBorders>
+              <w:top w:val="single" w:color="CBD5E1" w:sz="1"/>
+              <w:left w:val="single" w:color="CBD5E1" w:sz="1"/>
+              <w:bottom w:val="single" w:color="CBD5E1" w:sz="1"/>
+              <w:right w:val="single" w:color="CBD5E1" w:sz="1"/>
+            </w:tcBorders>
+            <w:tcMar>
+              <w:top w:type="dxa" w:w="60"/>
+              <w:left w:type="dxa" w:w="100"/>
+              <w:bottom w:type="dxa" w:w="60"/>
+              <w:right w:type="dxa" w:w="100"/>
+            </w:tcMar>
+          </w:tcPr>
+          <w:p>
+            <w:r>
+              <w:rPr>
+                <w:rFonts w:ascii="Calibri" w:cs="Calibri" w:eastAsia="Calibri" w:hAnsi="Calibri"/>
+                <w:sz w:val="20"/>
+                <w:szCs w:val="20"/>
+              </w:rPr>
+              <w:t xml:space="preserve">Swap seats with a partner and explain their design back to them.</w:t>
             </w:r>
           </w:p>
         </w:tc>
@@ -2161,34 +3119,34 @@
                 <w:sz w:val="20"/>
                 <w:szCs w:val="20"/>
               </w:rPr>
-              <w:t xml:space="preserve">Teacher prompt</w:t>
-            </w:r>
-          </w:p>
-        </w:tc>
-        <w:tc>
-          <w:tcPr>
-            <w:tcW w:type="dxa" w:w="6986"/>
-            <w:tcBorders>
-              <w:top w:val="single" w:color="CBD5E1" w:sz="1"/>
-              <w:left w:val="single" w:color="CBD5E1" w:sz="1"/>
-              <w:bottom w:val="single" w:color="CBD5E1" w:sz="1"/>
-              <w:right w:val="single" w:color="CBD5E1" w:sz="1"/>
-            </w:tcBorders>
-            <w:tcMar>
-              <w:top w:type="dxa" w:w="60"/>
-              <w:left w:type="dxa" w:w="100"/>
-              <w:bottom w:type="dxa" w:w="60"/>
-              <w:right w:type="dxa" w:w="100"/>
-            </w:tcMar>
-          </w:tcPr>
-          <w:p>
-            <w:r>
-              <w:rPr>
-                <w:rFonts w:ascii="Calibri" w:cs="Calibri" w:eastAsia="Calibri" w:hAnsi="Calibri"/>
-                <w:sz w:val="20"/>
-                <w:szCs w:val="20"/>
-              </w:rPr>
-              <w:t xml:space="preserve">“What usually works, and what evidence supports that?”</w:t>
+              <w:t xml:space="preserve">Reflection question</w:t>
+            </w:r>
+          </w:p>
+        </w:tc>
+        <w:tc>
+          <w:tcPr>
+            <w:tcW w:type="dxa" w:w="6986"/>
+            <w:tcBorders>
+              <w:top w:val="single" w:color="CBD5E1" w:sz="1"/>
+              <w:left w:val="single" w:color="CBD5E1" w:sz="1"/>
+              <w:bottom w:val="single" w:color="CBD5E1" w:sz="1"/>
+              <w:right w:val="single" w:color="CBD5E1" w:sz="1"/>
+            </w:tcBorders>
+            <w:tcMar>
+              <w:top w:type="dxa" w:w="60"/>
+              <w:left w:type="dxa" w:w="100"/>
+              <w:bottom w:type="dxa" w:w="60"/>
+              <w:right w:type="dxa" w:w="100"/>
+            </w:tcMar>
+          </w:tcPr>
+          <w:p>
+            <w:r>
+              <w:rPr>
+                <w:rFonts w:ascii="Calibri" w:cs="Calibri" w:eastAsia="Calibri" w:hAnsi="Calibri"/>
+                <w:sz w:val="20"/>
+                <w:szCs w:val="20"/>
+              </w:rPr>
+              <w:t xml:space="preserve">“Who does your change help, and who might it not help?”</w:t>
             </w:r>
           </w:p>
         </w:tc>
@@ -2244,7 +3202,7 @@
                 <w:sz w:val="20"/>
                 <w:szCs w:val="20"/>
               </w:rPr>
-              <w:t xml:space="preserve">One pattern statement supported by an example.</w:t>
+              <w:t xml:space="preserve">One design choice with one stated reason.</w:t>
             </w:r>
           </w:p>
         </w:tc>
@@ -2260,6 +3218,62 @@
               <w:right w:val="single" w:color="CBD5E1" w:sz="1"/>
             </w:tcBorders>
             <w:shd w:fill="F1F5F9" w:val="clear"/>
+            <w:tcMar>
+              <w:top w:type="dxa" w:w="60"/>
+              <w:left w:type="dxa" w:w="100"/>
+              <w:bottom w:type="dxa" w:w="60"/>
+              <w:right w:type="dxa" w:w="100"/>
+            </w:tcMar>
+          </w:tcPr>
+          <w:p>
+            <w:r>
+              <w:rPr>
+                <w:rFonts w:ascii="Calibri" w:cs="Calibri" w:eastAsia="Calibri" w:hAnsi="Calibri"/>
+                <w:sz w:val="20"/>
+                <w:szCs w:val="20"/>
+              </w:rPr>
+              <w:t xml:space="preserve">Stopping point</w:t>
+            </w:r>
+          </w:p>
+        </w:tc>
+        <w:tc>
+          <w:tcPr>
+            <w:tcW w:type="dxa" w:w="6986"/>
+            <w:tcBorders>
+              <w:top w:val="single" w:color="CBD5E1" w:sz="1"/>
+              <w:left w:val="single" w:color="CBD5E1" w:sz="1"/>
+              <w:bottom w:val="single" w:color="CBD5E1" w:sz="1"/>
+              <w:right w:val="single" w:color="CBD5E1" w:sz="1"/>
+            </w:tcBorders>
+            <w:tcMar>
+              <w:top w:type="dxa" w:w="60"/>
+              <w:left w:type="dxa" w:w="100"/>
+              <w:bottom w:type="dxa" w:w="60"/>
+              <w:right w:type="dxa" w:w="100"/>
+            </w:tcMar>
+          </w:tcPr>
+          <w:p>
+            <w:r>
+              <w:rPr>
+                <w:rFonts w:ascii="Calibri" w:cs="Calibri" w:eastAsia="Calibri" w:hAnsi="Calibri"/>
+                <w:sz w:val="20"/>
+                <w:szCs w:val="20"/>
+              </w:rPr>
+              <w:t xml:space="preserve">Session Six ends when every student has named one change and one person it helps.</w:t>
+            </w:r>
+          </w:p>
+        </w:tc>
+      </w:tr>
+      <w:tr>
+        <w:tc>
+          <w:tcPr>
+            <w:tcW w:type="dxa" w:w="2400"/>
+            <w:tcBorders>
+              <w:top w:val="single" w:color="CBD5E1" w:sz="1"/>
+              <w:left w:val="single" w:color="CBD5E1" w:sz="1"/>
+              <w:bottom w:val="single" w:color="CBD5E1" w:sz="1"/>
+              <w:right w:val="single" w:color="CBD5E1" w:sz="1"/>
+            </w:tcBorders>
             <w:tcMar>
               <w:top w:type="dxa" w:w="60"/>
               <w:left w:type="dxa" w:w="100"/>
@@ -2317,7 +3331,7 @@
         <w:pStyle w:val="Heading3"/>
       </w:pPr>
       <w:r>
-        <w:t xml:space="preserve">Session 7: Explain Your Thinking</w:t>
+        <w:t xml:space="preserve">Session 7: Test, Reflect and Improve</w:t>
       </w:r>
     </w:p>
     <w:tbl>
@@ -2421,48 +3435,105 @@
                 <w:sz w:val="20"/>
                 <w:szCs w:val="20"/>
               </w:rPr>
-              <w:t xml:space="preserve">Clear outcome</w:t>
-            </w:r>
-          </w:p>
-        </w:tc>
-        <w:tc>
-          <w:tcPr>
-            <w:tcW w:type="dxa" w:w="6986"/>
-            <w:tcBorders>
-              <w:top w:val="single" w:color="CBD5E1" w:sz="1"/>
-              <w:left w:val="single" w:color="CBD5E1" w:sz="1"/>
-              <w:bottom w:val="single" w:color="CBD5E1" w:sz="1"/>
-              <w:right w:val="single" w:color="CBD5E1" w:sz="1"/>
-            </w:tcBorders>
-            <w:tcMar>
-              <w:top w:type="dxa" w:w="60"/>
-              <w:left w:type="dxa" w:w="100"/>
-              <w:bottom w:type="dxa" w:w="60"/>
-              <w:right w:type="dxa" w:w="100"/>
-            </w:tcMar>
-          </w:tcPr>
-          <w:p>
-            <w:r>
-              <w:rPr>
-                <w:rFonts w:ascii="Calibri" w:cs="Calibri" w:eastAsia="Calibri" w:hAnsi="Calibri"/>
-                <w:sz w:val="20"/>
-                <w:szCs w:val="20"/>
-              </w:rPr>
-              <w:t xml:space="preserve">Students explain what they learned about systems, regulation and collaboration.</w:t>
-            </w:r>
-          </w:p>
-        </w:tc>
-      </w:tr>
-      <w:tr>
-        <w:tc>
-          <w:tcPr>
-            <w:tcW w:type="dxa" w:w="2400"/>
-            <w:tcBorders>
-              <w:top w:val="single" w:color="CBD5E1" w:sz="1"/>
-              <w:left w:val="single" w:color="CBD5E1" w:sz="1"/>
-              <w:bottom w:val="single" w:color="CBD5E1" w:sz="1"/>
-              <w:right w:val="single" w:color="CBD5E1" w:sz="1"/>
-            </w:tcBorders>
+              <w:t xml:space="preserve">Learning intention</w:t>
+            </w:r>
+          </w:p>
+        </w:tc>
+        <w:tc>
+          <w:tcPr>
+            <w:tcW w:type="dxa" w:w="6986"/>
+            <w:tcBorders>
+              <w:top w:val="single" w:color="CBD5E1" w:sz="1"/>
+              <w:left w:val="single" w:color="CBD5E1" w:sz="1"/>
+              <w:bottom w:val="single" w:color="CBD5E1" w:sz="1"/>
+              <w:right w:val="single" w:color="CBD5E1" w:sz="1"/>
+            </w:tcBorders>
+            <w:tcMar>
+              <w:top w:type="dxa" w:w="60"/>
+              <w:left w:type="dxa" w:w="100"/>
+              <w:bottom w:type="dxa" w:w="60"/>
+              <w:right w:type="dxa" w:w="100"/>
+            </w:tcMar>
+          </w:tcPr>
+          <w:p>
+            <w:r>
+              <w:rPr>
+                <w:rFonts w:ascii="Calibri" w:cs="Calibri" w:eastAsia="Calibri" w:hAnsi="Calibri"/>
+                <w:sz w:val="20"/>
+                <w:szCs w:val="20"/>
+              </w:rPr>
+              <w:t xml:space="preserve">I can test an idea, notice a pattern across the sequence, and explain my thinking.</w:t>
+            </w:r>
+          </w:p>
+        </w:tc>
+      </w:tr>
+      <w:tr>
+        <w:tc>
+          <w:tcPr>
+            <w:tcW w:type="dxa" w:w="2400"/>
+            <w:tcBorders>
+              <w:top w:val="single" w:color="CBD5E1" w:sz="1"/>
+              <w:left w:val="single" w:color="CBD5E1" w:sz="1"/>
+              <w:bottom w:val="single" w:color="CBD5E1" w:sz="1"/>
+              <w:right w:val="single" w:color="CBD5E1" w:sz="1"/>
+            </w:tcBorders>
+            <w:tcMar>
+              <w:top w:type="dxa" w:w="60"/>
+              <w:left w:type="dxa" w:w="100"/>
+              <w:bottom w:type="dxa" w:w="60"/>
+              <w:right w:type="dxa" w:w="100"/>
+            </w:tcMar>
+          </w:tcPr>
+          <w:p>
+            <w:r>
+              <w:rPr>
+                <w:rFonts w:ascii="Calibri" w:cs="Calibri" w:eastAsia="Calibri" w:hAnsi="Calibri"/>
+                <w:sz w:val="20"/>
+                <w:szCs w:val="20"/>
+              </w:rPr>
+              <w:t xml:space="preserve">Teacher introduction</w:t>
+            </w:r>
+          </w:p>
+        </w:tc>
+        <w:tc>
+          <w:tcPr>
+            <w:tcW w:type="dxa" w:w="6986"/>
+            <w:tcBorders>
+              <w:top w:val="single" w:color="CBD5E1" w:sz="1"/>
+              <w:left w:val="single" w:color="CBD5E1" w:sz="1"/>
+              <w:bottom w:val="single" w:color="CBD5E1" w:sz="1"/>
+              <w:right w:val="single" w:color="CBD5E1" w:sz="1"/>
+            </w:tcBorders>
+            <w:tcMar>
+              <w:top w:type="dxa" w:w="60"/>
+              <w:left w:type="dxa" w:w="100"/>
+              <w:bottom w:type="dxa" w:w="60"/>
+              <w:right w:type="dxa" w:w="100"/>
+            </w:tcMar>
+          </w:tcPr>
+          <w:p>
+            <w:r>
+              <w:rPr>
+                <w:rFonts w:ascii="Calibri" w:cs="Calibri" w:eastAsia="Calibri" w:hAnsi="Calibri"/>
+                <w:sz w:val="20"/>
+                <w:szCs w:val="20"/>
+              </w:rPr>
+              <w:t xml:space="preserve">This closes the sequence. Students look back across all seven sessions for something that happened more than once, then say what they would do differently. Finishing is the goal; being right is not.</w:t>
+            </w:r>
+          </w:p>
+        </w:tc>
+      </w:tr>
+      <w:tr>
+        <w:tc>
+          <w:tcPr>
+            <w:tcW w:type="dxa" w:w="2400"/>
+            <w:tcBorders>
+              <w:top w:val="single" w:color="CBD5E1" w:sz="1"/>
+              <w:left w:val="single" w:color="CBD5E1" w:sz="1"/>
+              <w:bottom w:val="single" w:color="CBD5E1" w:sz="1"/>
+              <w:right w:val="single" w:color="CBD5E1" w:sz="1"/>
+            </w:tcBorders>
+            <w:shd w:fill="F1F5F9" w:val="clear"/>
             <w:tcMar>
               <w:top w:type="dxa" w:w="60"/>
               <w:left w:type="dxa" w:w="100"/>
@@ -2504,7 +3575,63 @@
                 <w:sz w:val="20"/>
                 <w:szCs w:val="20"/>
               </w:rPr>
-              <w:t xml:space="preserve">Share one pattern, one useful strategy, and one thing they now understand more clearly.</w:t>
+              <w:t xml:space="preserve">Test one idea, find a pattern from earlier sessions, and explain it.</w:t>
+            </w:r>
+          </w:p>
+        </w:tc>
+      </w:tr>
+      <w:tr>
+        <w:tc>
+          <w:tcPr>
+            <w:tcW w:type="dxa" w:w="2400"/>
+            <w:tcBorders>
+              <w:top w:val="single" w:color="CBD5E1" w:sz="1"/>
+              <w:left w:val="single" w:color="CBD5E1" w:sz="1"/>
+              <w:bottom w:val="single" w:color="CBD5E1" w:sz="1"/>
+              <w:right w:val="single" w:color="CBD5E1" w:sz="1"/>
+            </w:tcBorders>
+            <w:tcMar>
+              <w:top w:type="dxa" w:w="60"/>
+              <w:left w:type="dxa" w:w="100"/>
+              <w:bottom w:type="dxa" w:w="60"/>
+              <w:right w:type="dxa" w:w="100"/>
+            </w:tcMar>
+          </w:tcPr>
+          <w:p>
+            <w:r>
+              <w:rPr>
+                <w:rFonts w:ascii="Calibri" w:cs="Calibri" w:eastAsia="Calibri" w:hAnsi="Calibri"/>
+                <w:sz w:val="20"/>
+                <w:szCs w:val="20"/>
+              </w:rPr>
+              <w:t xml:space="preserve">Movement moment</w:t>
+            </w:r>
+          </w:p>
+        </w:tc>
+        <w:tc>
+          <w:tcPr>
+            <w:tcW w:type="dxa" w:w="6986"/>
+            <w:tcBorders>
+              <w:top w:val="single" w:color="CBD5E1" w:sz="1"/>
+              <w:left w:val="single" w:color="CBD5E1" w:sz="1"/>
+              <w:bottom w:val="single" w:color="CBD5E1" w:sz="1"/>
+              <w:right w:val="single" w:color="CBD5E1" w:sz="1"/>
+            </w:tcBorders>
+            <w:tcMar>
+              <w:top w:type="dxa" w:w="60"/>
+              <w:left w:type="dxa" w:w="100"/>
+              <w:bottom w:type="dxa" w:w="60"/>
+              <w:right w:type="dxa" w:w="100"/>
+            </w:tcMar>
+          </w:tcPr>
+          <w:p>
+            <w:r>
+              <w:rPr>
+                <w:rFonts w:ascii="Calibri" w:cs="Calibri" w:eastAsia="Calibri" w:hAnsi="Calibri"/>
+                <w:sz w:val="20"/>
+                <w:szCs w:val="20"/>
+              </w:rPr>
+              <w:t xml:space="preserve">Stand in a line from "I am sure" to "I am still thinking" and say why you stood there.</w:t>
             </w:r>
           </w:p>
         </w:tc>
@@ -2534,34 +3661,34 @@
                 <w:sz w:val="20"/>
                 <w:szCs w:val="20"/>
               </w:rPr>
-              <w:t xml:space="preserve">Teacher prompt</w:t>
-            </w:r>
-          </w:p>
-        </w:tc>
-        <w:tc>
-          <w:tcPr>
-            <w:tcW w:type="dxa" w:w="6986"/>
-            <w:tcBorders>
-              <w:top w:val="single" w:color="CBD5E1" w:sz="1"/>
-              <w:left w:val="single" w:color="CBD5E1" w:sz="1"/>
-              <w:bottom w:val="single" w:color="CBD5E1" w:sz="1"/>
-              <w:right w:val="single" w:color="CBD5E1" w:sz="1"/>
-            </w:tcBorders>
-            <w:tcMar>
-              <w:top w:type="dxa" w:w="60"/>
-              <w:left w:type="dxa" w:w="100"/>
-              <w:bottom w:type="dxa" w:w="60"/>
-              <w:right w:type="dxa" w:w="100"/>
-            </w:tcMar>
-          </w:tcPr>
-          <w:p>
-            <w:r>
-              <w:rPr>
-                <w:rFonts w:ascii="Calibri" w:cs="Calibri" w:eastAsia="Calibri" w:hAnsi="Calibri"/>
-                <w:sz w:val="20"/>
-                <w:szCs w:val="20"/>
-              </w:rPr>
-              <w:t xml:space="preserve">“What did this digital companion help you notice about systems or behaviour?”</w:t>
+              <w:t xml:space="preserve">Reflection question</w:t>
+            </w:r>
+          </w:p>
+        </w:tc>
+        <w:tc>
+          <w:tcPr>
+            <w:tcW w:type="dxa" w:w="6986"/>
+            <w:tcBorders>
+              <w:top w:val="single" w:color="CBD5E1" w:sz="1"/>
+              <w:left w:val="single" w:color="CBD5E1" w:sz="1"/>
+              <w:bottom w:val="single" w:color="CBD5E1" w:sz="1"/>
+              <w:right w:val="single" w:color="CBD5E1" w:sz="1"/>
+            </w:tcBorders>
+            <w:tcMar>
+              <w:top w:type="dxa" w:w="60"/>
+              <w:left w:type="dxa" w:w="100"/>
+              <w:bottom w:type="dxa" w:w="60"/>
+              <w:right w:type="dxa" w:w="100"/>
+            </w:tcMar>
+          </w:tcPr>
+          <w:p>
+            <w:r>
+              <w:rPr>
+                <w:rFonts w:ascii="Calibri" w:cs="Calibri" w:eastAsia="Calibri" w:hAnsi="Calibri"/>
+                <w:sz w:val="20"/>
+                <w:szCs w:val="20"/>
+              </w:rPr>
+              <w:t xml:space="preserve">“What pattern did you notice, and what would you try next time?”</w:t>
             </w:r>
           </w:p>
         </w:tc>
@@ -2617,7 +3744,7 @@
                 <w:sz w:val="20"/>
                 <w:szCs w:val="20"/>
               </w:rPr>
-              <w:t xml:space="preserve">One short student reflection or teacher observation note.</w:t>
+              <w:t xml:space="preserve">One pattern statement with one supporting example.</w:t>
             </w:r>
           </w:p>
         </w:tc>
@@ -2647,6 +3774,62 @@
                 <w:sz w:val="20"/>
                 <w:szCs w:val="20"/>
               </w:rPr>
+              <w:t xml:space="preserve">Stopping point</w:t>
+            </w:r>
+          </w:p>
+        </w:tc>
+        <w:tc>
+          <w:tcPr>
+            <w:tcW w:type="dxa" w:w="6986"/>
+            <w:tcBorders>
+              <w:top w:val="single" w:color="CBD5E1" w:sz="1"/>
+              <w:left w:val="single" w:color="CBD5E1" w:sz="1"/>
+              <w:bottom w:val="single" w:color="CBD5E1" w:sz="1"/>
+              <w:right w:val="single" w:color="CBD5E1" w:sz="1"/>
+            </w:tcBorders>
+            <w:tcMar>
+              <w:top w:type="dxa" w:w="60"/>
+              <w:left w:type="dxa" w:w="100"/>
+              <w:bottom w:type="dxa" w:w="60"/>
+              <w:right w:type="dxa" w:w="100"/>
+            </w:tcMar>
+          </w:tcPr>
+          <w:p>
+            <w:r>
+              <w:rPr>
+                <w:rFonts w:ascii="Calibri" w:cs="Calibri" w:eastAsia="Calibri" w:hAnsi="Calibri"/>
+                <w:sz w:val="20"/>
+                <w:szCs w:val="20"/>
+              </w:rPr>
+              <w:t xml:space="preserve">Session Seven ends the sequence. The class has finished; nothing is left open.</w:t>
+            </w:r>
+          </w:p>
+        </w:tc>
+      </w:tr>
+      <w:tr>
+        <w:tc>
+          <w:tcPr>
+            <w:tcW w:type="dxa" w:w="2400"/>
+            <w:tcBorders>
+              <w:top w:val="single" w:color="CBD5E1" w:sz="1"/>
+              <w:left w:val="single" w:color="CBD5E1" w:sz="1"/>
+              <w:bottom w:val="single" w:color="CBD5E1" w:sz="1"/>
+              <w:right w:val="single" w:color="CBD5E1" w:sz="1"/>
+            </w:tcBorders>
+            <w:tcMar>
+              <w:top w:type="dxa" w:w="60"/>
+              <w:left w:type="dxa" w:w="100"/>
+              <w:bottom w:type="dxa" w:w="60"/>
+              <w:right w:type="dxa" w:w="100"/>
+            </w:tcMar>
+          </w:tcPr>
+          <w:p>
+            <w:r>
+              <w:rPr>
+                <w:rFonts w:ascii="Calibri" w:cs="Calibri" w:eastAsia="Calibri" w:hAnsi="Calibri"/>
+                <w:sz w:val="20"/>
+                <w:szCs w:val="20"/>
+              </w:rPr>
               <w:t xml:space="preserve">Best-fit use case</w:t>
             </w:r>
           </w:p>
@@ -2674,7 +3857,7 @@
                 <w:sz w:val="20"/>
                 <w:szCs w:val="20"/>
               </w:rPr>
-              <w:t xml:space="preserve">STEM block or end-of-week showcase</w:t>
+              <w:t xml:space="preserve">STEM block</w:t>
             </w:r>
           </w:p>
         </w:tc>
@@ -2717,10 +3900,10 @@
           <w:b/>
           <w:bCs/>
         </w:rPr>
-        <w:t xml:space="preserve">Short Digital Technologies: </w:t>
+        <w:t xml:space="preserve">Short systems sequence: </w:t>
       </w:r>
       <w:r>
-        <w:t xml:space="preserve">Use Sessions 1, 2, 5 and 6.</w:t>
+        <w:t xml:space="preserve">Use Sessions 1–3.</w:t>
       </w:r>
     </w:p>
     <w:p>
@@ -2732,10 +3915,10 @@
           <w:b/>
           <w:bCs/>
         </w:rPr>
-        <w:t xml:space="preserve">Short wellbeing: </w:t>
+        <w:t xml:space="preserve">Short digital responsibility sequence: </w:t>
       </w:r>
       <w:r>
-        <w:t xml:space="preserve">Use Sessions 1, 3, 4 and 7.</w:t>
+        <w:t xml:space="preserve">Use Sessions 1, 2 and 5.</w:t>
       </w:r>
     </w:p>
     <w:p>
@@ -2747,10 +3930,10 @@
           <w:b/>
           <w:bCs/>
         </w:rPr>
-        <w:t xml:space="preserve">Low-prep relief: </w:t>
+        <w:t xml:space="preserve">Single-session taster: </w:t>
       </w:r>
       <w:r>
-        <w:t xml:space="preserve">Use Session 1 as the entry lesson or Session 4 as standalone.</w:t>
+        <w:t xml:space="preserve">Use Session 1 as a complete standalone lesson.</w:t>
       </w:r>
     </w:p>
     <w:sectPr>

</xml_diff>